<commit_message>
Updating Activities/L3 - FIR Filter.docx
</commit_message>
<xml_diff>
--- a/Activities/L3 - FIR Filter.docx
+++ b/Activities/L3 - FIR Filter.docx
@@ -52,15 +52,35 @@
                 <w:szCs w:val="20"/>
               </w:rPr>
             </w:pPr>
+          </w:p>
+          <w:p>
+            <w:pPr>
+              <w:jc w:val="center"/>
+              <w:rPr>
+                <w:rFonts w:ascii="Calibri Light" w:hAnsi="Calibri Light" w:cs="Arial"/>
+                <w:sz w:val="20"/>
+                <w:szCs w:val="20"/>
+              </w:rPr>
+            </w:pPr>
+          </w:p>
+          <w:p>
+            <w:pPr>
+              <w:jc w:val="center"/>
+              <w:rPr>
+                <w:rFonts w:ascii="Calibri Light" w:hAnsi="Calibri Light" w:cs="Arial"/>
+                <w:sz w:val="20"/>
+                <w:szCs w:val="20"/>
+              </w:rPr>
+            </w:pPr>
             <w:r>
               <w:rPr>
                 <w:noProof/>
               </w:rPr>
               <w:drawing>
-                <wp:inline distT="0" distB="0" distL="0" distR="0" wp14:anchorId="018EA456" wp14:editId="2707EF69">
-                  <wp:extent cx="1055370" cy="824865"/>
-                  <wp:effectExtent l="0" t="0" r="0" b="0"/>
-                  <wp:docPr id="223738303" name="Picture 1"/>
+                <wp:inline distT="0" distB="0" distL="0" distR="0" wp14:anchorId="3CC04970" wp14:editId="4A7606A1">
+                  <wp:extent cx="1433384" cy="1046234"/>
+                  <wp:effectExtent l="0" t="0" r="1905" b="0"/>
+                  <wp:docPr id="1" name="Picture 1" descr="NUCLEO-H533RE STMicroelectronics | Placas de desarrollo, kits,  programadores | DigiKey"/>
                   <wp:cNvGraphicFramePr>
                     <a:graphicFrameLocks xmlns:a="http://schemas.openxmlformats.org/drawingml/2006/main" noChangeAspect="1"/>
                   </wp:cNvGraphicFramePr>
@@ -68,24 +88,31 @@
                     <a:graphicData uri="http://schemas.openxmlformats.org/drawingml/2006/picture">
                       <pic:pic xmlns:pic="http://schemas.openxmlformats.org/drawingml/2006/picture">
                         <pic:nvPicPr>
-                          <pic:cNvPr id="223738303" name="Picture 1"/>
+                          <pic:cNvPr id="0" name="Picture 1" descr="NUCLEO-H533RE STMicroelectronics | Placas de desarrollo, kits,  programadores | DigiKey"/>
                           <pic:cNvPicPr>
-                            <a:picLocks noChangeAspect="1"/>
+                            <a:picLocks noChangeAspect="1" noChangeArrowheads="1"/>
                           </pic:cNvPicPr>
                         </pic:nvPicPr>
                         <pic:blipFill rotWithShape="1">
-                          <a:blip r:embed="rId8"/>
-                          <a:srcRect l="3127" t="12504" r="3354" b="14367"/>
+                          <a:blip r:embed="rId8" cstate="print">
+                            <a:extLst>
+                              <a:ext uri="{28A0092B-C50C-407E-A947-70E740481C1C}">
+                                <a14:useLocalDpi xmlns:a14="http://schemas.microsoft.com/office/drawing/2010/main" val="0"/>
+                              </a:ext>
+                            </a:extLst>
+                          </a:blip>
+                          <a:srcRect l="7180" t="17837" r="4649" b="17806"/>
                           <a:stretch/>
                         </pic:blipFill>
                         <pic:spPr bwMode="auto">
                           <a:xfrm>
                             <a:off x="0" y="0"/>
-                            <a:ext cx="1055370" cy="824865"/>
+                            <a:ext cx="1469882" cy="1072874"/>
                           </a:xfrm>
                           <a:prstGeom prst="rect">
                             <a:avLst/>
                           </a:prstGeom>
+                          <a:noFill/>
                           <a:ln>
                             <a:noFill/>
                           </a:ln>
@@ -482,7 +509,6 @@
           </w:tcPr>
           <w:p>
             <w:pPr>
-              <w:jc w:val="center"/>
               <w:rPr>
                 <w:noProof/>
                 <w:lang w:val="en-US" w:eastAsia="es-MX"/>
@@ -918,13 +944,14 @@
       </w:pPr>
       <w:r>
         <w:rPr>
-          <w:noProof/>
+          <w:rFonts w:ascii="Arial Narrow" w:hAnsi="Arial Narrow" w:cs="Arial"/>
+          <w:lang w:val="en-US"/>
         </w:rPr>
         <w:drawing>
-          <wp:inline distT="0" distB="0" distL="0" distR="0" wp14:anchorId="140F201A" wp14:editId="4E40B730">
-            <wp:extent cx="5941210" cy="2602230"/>
-            <wp:effectExtent l="0" t="0" r="2540" b="7620"/>
-            <wp:docPr id="1285610484" name="Picture 1"/>
+          <wp:inline distT="0" distB="0" distL="0" distR="0" wp14:anchorId="1EBCB0FB" wp14:editId="650D4DFE">
+            <wp:extent cx="6871970" cy="2705735"/>
+            <wp:effectExtent l="0" t="0" r="0" b="0"/>
+            <wp:docPr id="1226566668" name="Picture 1"/>
             <wp:cNvGraphicFramePr>
               <a:graphicFrameLocks xmlns:a="http://schemas.openxmlformats.org/drawingml/2006/main" noChangeAspect="1"/>
             </wp:cNvGraphicFramePr>
@@ -932,7 +959,7 @@
               <a:graphicData uri="http://schemas.openxmlformats.org/drawingml/2006/picture">
                 <pic:pic xmlns:pic="http://schemas.openxmlformats.org/drawingml/2006/picture">
                   <pic:nvPicPr>
-                    <pic:cNvPr id="1285610484" name=""/>
+                    <pic:cNvPr id="1226566668" name=""/>
                     <pic:cNvPicPr/>
                   </pic:nvPicPr>
                   <pic:blipFill>
@@ -944,7 +971,7 @@
                   <pic:spPr>
                     <a:xfrm>
                       <a:off x="0" y="0"/>
-                      <a:ext cx="5950860" cy="2606457"/>
+                      <a:ext cx="6871970" cy="2705735"/>
                     </a:xfrm>
                     <a:prstGeom prst="rect">
                       <a:avLst/>
@@ -1725,23 +1752,39 @@
                 <w:rFonts w:ascii="Arial Narrow" w:hAnsi="Arial Narrow" w:cs="Arial"/>
                 <w:lang w:val="en-US"/>
               </w:rPr>
-              <w:t>ADC12_COMMON-&gt;CCR |= ADC_CCR_CKMODE_0;</w:t>
-            </w:r>
-          </w:p>
-          <w:p>
-            <w:pPr>
-              <w:spacing w:after="0" w:line="240" w:lineRule="auto"/>
-              <w:rPr>
-                <w:rFonts w:ascii="Arial Narrow" w:hAnsi="Arial Narrow" w:cs="Arial"/>
-                <w:lang w:val="en-US"/>
-              </w:rPr>
-            </w:pPr>
-            <w:r>
-              <w:rPr>
-                <w:rFonts w:ascii="Arial Narrow" w:hAnsi="Arial Narrow" w:cs="Arial"/>
-                <w:lang w:val="en-US"/>
-              </w:rPr>
-              <w:t xml:space="preserve">  ADC1-&gt;CR    &amp;= ~ADC_CR_DEEPPWD;</w:t>
+              <w:t>ADC12_COMMON-&gt;CCR |</w:t>
+            </w:r>
+            <w:proofErr w:type="gramStart"/>
+            <w:r>
+              <w:rPr>
+                <w:rFonts w:ascii="Arial Narrow" w:hAnsi="Arial Narrow" w:cs="Arial"/>
+                <w:lang w:val="en-US"/>
+              </w:rPr>
+              <w:t>=  ADC</w:t>
+            </w:r>
+            <w:proofErr w:type="gramEnd"/>
+            <w:r>
+              <w:rPr>
+                <w:rFonts w:ascii="Arial Narrow" w:hAnsi="Arial Narrow" w:cs="Arial"/>
+                <w:lang w:val="en-US"/>
+              </w:rPr>
+              <w:t>_CCR_CKMODE_1;</w:t>
+            </w:r>
+          </w:p>
+          <w:p>
+            <w:pPr>
+              <w:spacing w:after="0" w:line="240" w:lineRule="auto"/>
+              <w:rPr>
+                <w:rFonts w:ascii="Arial Narrow" w:hAnsi="Arial Narrow" w:cs="Arial"/>
+                <w:lang w:val="en-US"/>
+              </w:rPr>
+            </w:pPr>
+            <w:r>
+              <w:rPr>
+                <w:rFonts w:ascii="Arial Narrow" w:hAnsi="Arial Narrow" w:cs="Arial"/>
+                <w:lang w:val="en-US"/>
+              </w:rPr>
+              <w:t xml:space="preserve">  ADC1-&gt;CR          &amp;= ~ADC_CR_DEEPPWD;</w:t>
             </w:r>
           </w:p>
           <w:p>
@@ -1772,7 +1815,7 @@
                 <w:lang w:val="en-US"/>
               </w:rPr>
               <w:tab/>
-              <w:t>&amp;=</w:t>
+              <w:t xml:space="preserve">      &amp;= ~ADC_CR_ADVREGEN;</w:t>
             </w:r>
             <w:r>
               <w:rPr>
@@ -1780,7 +1823,22 @@
                 <w:lang w:val="en-US"/>
               </w:rPr>
               <w:tab/>
-              <w:t>~ADC_CR_ADVREGEN;</w:t>
+            </w:r>
+          </w:p>
+          <w:p>
+            <w:pPr>
+              <w:spacing w:after="0" w:line="240" w:lineRule="auto"/>
+              <w:rPr>
+                <w:rFonts w:ascii="Arial Narrow" w:hAnsi="Arial Narrow" w:cs="Arial"/>
+                <w:lang w:val="en-US"/>
+              </w:rPr>
+            </w:pPr>
+            <w:r>
+              <w:rPr>
+                <w:rFonts w:ascii="Arial Narrow" w:hAnsi="Arial Narrow" w:cs="Arial"/>
+                <w:lang w:val="en-US"/>
+              </w:rPr>
+              <w:t xml:space="preserve">  ADC1-&gt;CR</w:t>
             </w:r>
             <w:r>
               <w:rPr>
@@ -1789,44 +1847,29 @@
               </w:rPr>
               <w:tab/>
             </w:r>
-          </w:p>
-          <w:p>
-            <w:pPr>
-              <w:spacing w:after="0" w:line="240" w:lineRule="auto"/>
-              <w:rPr>
-                <w:rFonts w:ascii="Arial Narrow" w:hAnsi="Arial Narrow" w:cs="Arial"/>
-                <w:lang w:val="en-US"/>
-              </w:rPr>
-            </w:pPr>
-            <w:r>
-              <w:rPr>
-                <w:rFonts w:ascii="Arial Narrow" w:hAnsi="Arial Narrow" w:cs="Arial"/>
-                <w:lang w:val="en-US"/>
-              </w:rPr>
-              <w:t xml:space="preserve">  ADC1-&gt;CR</w:t>
-            </w:r>
             <w:r>
               <w:rPr>
                 <w:rFonts w:ascii="Arial Narrow" w:hAnsi="Arial Narrow" w:cs="Arial"/>
                 <w:lang w:val="en-US"/>
               </w:rPr>
               <w:tab/>
-            </w:r>
-            <w:r>
-              <w:rPr>
-                <w:rFonts w:ascii="Arial Narrow" w:hAnsi="Arial Narrow" w:cs="Arial"/>
-                <w:lang w:val="en-US"/>
-              </w:rPr>
-              <w:tab/>
-              <w:t>|=</w:t>
-            </w:r>
-            <w:r>
-              <w:rPr>
-                <w:rFonts w:ascii="Arial Narrow" w:hAnsi="Arial Narrow" w:cs="Arial"/>
-                <w:lang w:val="en-US"/>
-              </w:rPr>
-              <w:tab/>
-              <w:t>ADC_CR_ADVREGEN;</w:t>
+              <w:t xml:space="preserve">      |</w:t>
+            </w:r>
+            <w:proofErr w:type="gramStart"/>
+            <w:r>
+              <w:rPr>
+                <w:rFonts w:ascii="Arial Narrow" w:hAnsi="Arial Narrow" w:cs="Arial"/>
+                <w:lang w:val="en-US"/>
+              </w:rPr>
+              <w:t>=  ADC</w:t>
+            </w:r>
+            <w:proofErr w:type="gramEnd"/>
+            <w:r>
+              <w:rPr>
+                <w:rFonts w:ascii="Arial Narrow" w:hAnsi="Arial Narrow" w:cs="Arial"/>
+                <w:lang w:val="en-US"/>
+              </w:rPr>
+              <w:t>_CR_ADVREGEN;</w:t>
             </w:r>
           </w:p>
           <w:p>
@@ -1858,22 +1901,7 @@
                 <w:rFonts w:ascii="Arial Narrow" w:hAnsi="Arial Narrow" w:cs="Arial"/>
                 <w:lang w:val="en-US"/>
               </w:rPr>
-              <w:t xml:space="preserve">  ADC1-&gt;CR</w:t>
-            </w:r>
-            <w:r>
-              <w:rPr>
-                <w:rFonts w:ascii="Arial Narrow" w:hAnsi="Arial Narrow" w:cs="Arial"/>
-                <w:lang w:val="en-US"/>
-              </w:rPr>
-              <w:tab/>
-            </w:r>
-            <w:r>
-              <w:rPr>
-                <w:rFonts w:ascii="Arial Narrow" w:hAnsi="Arial Narrow" w:cs="Arial"/>
-                <w:lang w:val="en-US"/>
-              </w:rPr>
-              <w:tab/>
-              <w:t>|=</w:t>
+              <w:t xml:space="preserve">  ADC1-&gt;CR |=</w:t>
             </w:r>
             <w:r>
               <w:rPr>
@@ -1954,22 +1982,7 @@
                 <w:rFonts w:ascii="Arial Narrow" w:hAnsi="Arial Narrow" w:cs="Arial"/>
                 <w:lang w:val="en-US"/>
               </w:rPr>
-              <w:t xml:space="preserve">  ADC1-&gt;CFGR</w:t>
-            </w:r>
-            <w:r>
-              <w:rPr>
-                <w:rFonts w:ascii="Arial Narrow" w:hAnsi="Arial Narrow" w:cs="Arial"/>
-                <w:lang w:val="en-US"/>
-              </w:rPr>
-              <w:tab/>
-            </w:r>
-            <w:r>
-              <w:rPr>
-                <w:rFonts w:ascii="Arial Narrow" w:hAnsi="Arial Narrow" w:cs="Arial"/>
-                <w:lang w:val="en-US"/>
-              </w:rPr>
-              <w:tab/>
-              <w:t>&amp;=</w:t>
+              <w:t xml:space="preserve">  ADC1-&gt;CFGR &amp;=</w:t>
             </w:r>
             <w:r>
               <w:rPr>
@@ -1993,22 +2006,7 @@
                 <w:rFonts w:ascii="Arial Narrow" w:hAnsi="Arial Narrow" w:cs="Arial"/>
                 <w:lang w:val="en-US"/>
               </w:rPr>
-              <w:t xml:space="preserve">  ADC1-&gt;CFGR</w:t>
-            </w:r>
-            <w:r>
-              <w:rPr>
-                <w:rFonts w:ascii="Arial Narrow" w:hAnsi="Arial Narrow" w:cs="Arial"/>
-                <w:lang w:val="en-US"/>
-              </w:rPr>
-              <w:tab/>
-            </w:r>
-            <w:r>
-              <w:rPr>
-                <w:rFonts w:ascii="Arial Narrow" w:hAnsi="Arial Narrow" w:cs="Arial"/>
-                <w:lang w:val="en-US"/>
-              </w:rPr>
-              <w:tab/>
-              <w:t>&amp;=</w:t>
+              <w:t xml:space="preserve">  ADC1-&gt;CFGR &amp;=</w:t>
             </w:r>
             <w:r>
               <w:rPr>
@@ -2032,22 +2030,7 @@
                 <w:rFonts w:ascii="Arial Narrow" w:hAnsi="Arial Narrow" w:cs="Arial"/>
                 <w:lang w:val="en-US"/>
               </w:rPr>
-              <w:t xml:space="preserve">  ADC1-&gt;CFGR</w:t>
-            </w:r>
-            <w:r>
-              <w:rPr>
-                <w:rFonts w:ascii="Arial Narrow" w:hAnsi="Arial Narrow" w:cs="Arial"/>
-                <w:lang w:val="en-US"/>
-              </w:rPr>
-              <w:tab/>
-            </w:r>
-            <w:r>
-              <w:rPr>
-                <w:rFonts w:ascii="Arial Narrow" w:hAnsi="Arial Narrow" w:cs="Arial"/>
-                <w:lang w:val="en-US"/>
-              </w:rPr>
-              <w:tab/>
-              <w:t>&amp;=</w:t>
+              <w:t xml:space="preserve">  ADC1-&gt;CFGR &amp;=</w:t>
             </w:r>
             <w:r>
               <w:rPr>
@@ -2080,22 +2063,7 @@
                 <w:rFonts w:ascii="Arial Narrow" w:hAnsi="Arial Narrow" w:cs="Arial"/>
                 <w:lang w:val="en-US"/>
               </w:rPr>
-              <w:t xml:space="preserve">  ADC1-&gt;SQR1</w:t>
-            </w:r>
-            <w:r>
-              <w:rPr>
-                <w:rFonts w:ascii="Arial Narrow" w:hAnsi="Arial Narrow" w:cs="Arial"/>
-                <w:lang w:val="en-US"/>
-              </w:rPr>
-              <w:tab/>
-            </w:r>
-            <w:r>
-              <w:rPr>
-                <w:rFonts w:ascii="Arial Narrow" w:hAnsi="Arial Narrow" w:cs="Arial"/>
-                <w:lang w:val="en-US"/>
-              </w:rPr>
-              <w:tab/>
-              <w:t>&amp;=</w:t>
+              <w:t xml:space="preserve">  ADC1-&gt;SQR1 &amp;=</w:t>
             </w:r>
             <w:r>
               <w:rPr>
@@ -2119,22 +2087,7 @@
                 <w:rFonts w:ascii="Arial Narrow" w:hAnsi="Arial Narrow" w:cs="Arial"/>
                 <w:lang w:val="en-US"/>
               </w:rPr>
-              <w:t xml:space="preserve">  ADC1-&gt;SQR1</w:t>
-            </w:r>
-            <w:r>
-              <w:rPr>
-                <w:rFonts w:ascii="Arial Narrow" w:hAnsi="Arial Narrow" w:cs="Arial"/>
-                <w:lang w:val="en-US"/>
-              </w:rPr>
-              <w:tab/>
-            </w:r>
-            <w:r>
-              <w:rPr>
-                <w:rFonts w:ascii="Arial Narrow" w:hAnsi="Arial Narrow" w:cs="Arial"/>
-                <w:lang w:val="en-US"/>
-              </w:rPr>
-              <w:tab/>
-              <w:t>|=</w:t>
+              <w:t xml:space="preserve">  ADC1-&gt;SQR1 |=</w:t>
             </w:r>
             <w:r>
               <w:rPr>
@@ -2167,22 +2120,7 @@
                 <w:rFonts w:ascii="Arial Narrow" w:hAnsi="Arial Narrow" w:cs="Arial"/>
                 <w:lang w:val="en-US"/>
               </w:rPr>
-              <w:t xml:space="preserve">  ADC1-&gt;SMPR1</w:t>
-            </w:r>
-            <w:r>
-              <w:rPr>
-                <w:rFonts w:ascii="Arial Narrow" w:hAnsi="Arial Narrow" w:cs="Arial"/>
-                <w:lang w:val="en-US"/>
-              </w:rPr>
-              <w:tab/>
-            </w:r>
-            <w:r>
-              <w:rPr>
-                <w:rFonts w:ascii="Arial Narrow" w:hAnsi="Arial Narrow" w:cs="Arial"/>
-                <w:lang w:val="en-US"/>
-              </w:rPr>
-              <w:tab/>
-              <w:t>&amp;=</w:t>
+              <w:t xml:space="preserve">  ADC1-&gt;SMPR1 &amp;=</w:t>
             </w:r>
             <w:r>
               <w:rPr>
@@ -2215,30 +2153,7 @@
                 <w:rFonts w:ascii="Arial Narrow" w:hAnsi="Arial Narrow" w:cs="Arial"/>
                 <w:lang w:val="en-US"/>
               </w:rPr>
-              <w:t xml:space="preserve">  ADC1-&gt;CR</w:t>
-            </w:r>
-            <w:r>
-              <w:rPr>
-                <w:rFonts w:ascii="Arial Narrow" w:hAnsi="Arial Narrow" w:cs="Arial"/>
-                <w:lang w:val="en-US"/>
-              </w:rPr>
-              <w:tab/>
-            </w:r>
-            <w:r>
-              <w:rPr>
-                <w:rFonts w:ascii="Arial Narrow" w:hAnsi="Arial Narrow" w:cs="Arial"/>
-                <w:lang w:val="en-US"/>
-              </w:rPr>
-              <w:tab/>
-              <w:t>|=</w:t>
-            </w:r>
-            <w:r>
-              <w:rPr>
-                <w:rFonts w:ascii="Arial Narrow" w:hAnsi="Arial Narrow" w:cs="Arial"/>
-                <w:lang w:val="en-US"/>
-              </w:rPr>
-              <w:tab/>
-              <w:t>ADC_CR_ADEN;</w:t>
+              <w:t xml:space="preserve">  ADC1-&gt;CR |= ADC_CR_ADEN;</w:t>
             </w:r>
           </w:p>
           <w:p>
@@ -2430,21 +2345,7 @@
                 <w:rFonts w:ascii="Arial Narrow" w:hAnsi="Arial Narrow" w:cs="Arial"/>
                 <w:lang w:val="en-US"/>
               </w:rPr>
-              <w:t xml:space="preserve">  TIM2-&gt;ARR = 24e</w:t>
-            </w:r>
-            <w:r>
-              <w:rPr>
-                <w:rFonts w:ascii="Arial Narrow" w:hAnsi="Arial Narrow" w:cs="Arial"/>
-                <w:lang w:val="en-US"/>
-              </w:rPr>
-              <w:t>6</w:t>
-            </w:r>
-            <w:r>
-              <w:rPr>
-                <w:rFonts w:ascii="Arial Narrow" w:hAnsi="Arial Narrow" w:cs="Arial"/>
-                <w:lang w:val="en-US"/>
-              </w:rPr>
-              <w:t xml:space="preserve"> - 1;</w:t>
+              <w:t xml:space="preserve">  TIM2-&gt;ARR = 24e6 - 1;</w:t>
             </w:r>
           </w:p>
           <w:p>
@@ -2599,6 +2500,447 @@
                 <w:lang w:val="en-US"/>
               </w:rPr>
             </w:pPr>
+          </w:p>
+          <w:p>
+            <w:pPr>
+              <w:spacing w:after="0" w:line="240" w:lineRule="auto"/>
+              <w:rPr>
+                <w:rFonts w:ascii="Arial Narrow" w:hAnsi="Arial Narrow" w:cs="Arial"/>
+                <w:lang w:val="en-US"/>
+              </w:rPr>
+            </w:pPr>
+            <w:r>
+              <w:rPr>
+                <w:rFonts w:ascii="Arial Narrow" w:hAnsi="Arial Narrow" w:cs="Arial"/>
+                <w:lang w:val="en-US"/>
+              </w:rPr>
+              <w:t xml:space="preserve">  while (1)</w:t>
+            </w:r>
+          </w:p>
+          <w:p>
+            <w:pPr>
+              <w:spacing w:after="0" w:line="240" w:lineRule="auto"/>
+              <w:rPr>
+                <w:rFonts w:ascii="Arial Narrow" w:hAnsi="Arial Narrow" w:cs="Arial"/>
+                <w:lang w:val="en-US"/>
+              </w:rPr>
+            </w:pPr>
+            <w:r>
+              <w:rPr>
+                <w:rFonts w:ascii="Arial Narrow" w:hAnsi="Arial Narrow" w:cs="Arial"/>
+                <w:lang w:val="en-US"/>
+              </w:rPr>
+              <w:t xml:space="preserve">  {</w:t>
+            </w:r>
+          </w:p>
+          <w:p>
+            <w:pPr>
+              <w:spacing w:after="0" w:line="240" w:lineRule="auto"/>
+              <w:rPr>
+                <w:rFonts w:ascii="Arial Narrow" w:hAnsi="Arial Narrow" w:cs="Arial"/>
+                <w:lang w:val="en-US"/>
+              </w:rPr>
+            </w:pPr>
+            <w:r>
+              <w:rPr>
+                <w:rFonts w:ascii="Arial Narrow" w:hAnsi="Arial Narrow" w:cs="Arial"/>
+                <w:lang w:val="en-US"/>
+              </w:rPr>
+              <w:t xml:space="preserve">    </w:t>
+            </w:r>
+          </w:p>
+          <w:p>
+            <w:pPr>
+              <w:spacing w:after="0" w:line="240" w:lineRule="auto"/>
+              <w:rPr>
+                <w:rFonts w:ascii="Arial Narrow" w:hAnsi="Arial Narrow" w:cs="Arial"/>
+                <w:lang w:val="en-US"/>
+              </w:rPr>
+            </w:pPr>
+            <w:r>
+              <w:rPr>
+                <w:rFonts w:ascii="Arial Narrow" w:hAnsi="Arial Narrow" w:cs="Arial"/>
+                <w:lang w:val="en-US"/>
+              </w:rPr>
+              <w:lastRenderedPageBreak/>
+              <w:t xml:space="preserve">  }</w:t>
+            </w:r>
+          </w:p>
+          <w:p>
+            <w:pPr>
+              <w:spacing w:after="0" w:line="240" w:lineRule="auto"/>
+              <w:rPr>
+                <w:rFonts w:ascii="Arial Narrow" w:hAnsi="Arial Narrow" w:cs="Arial"/>
+                <w:lang w:val="en-US"/>
+              </w:rPr>
+            </w:pPr>
+            <w:r>
+              <w:rPr>
+                <w:rFonts w:ascii="Arial Narrow" w:hAnsi="Arial Narrow" w:cs="Arial"/>
+                <w:lang w:val="en-US"/>
+              </w:rPr>
+              <w:t>}</w:t>
+            </w:r>
+          </w:p>
+          <w:p>
+            <w:pPr>
+              <w:spacing w:after="0" w:line="240" w:lineRule="auto"/>
+              <w:rPr>
+                <w:rFonts w:ascii="Arial Narrow" w:hAnsi="Arial Narrow" w:cs="Arial"/>
+                <w:lang w:val="en-US"/>
+              </w:rPr>
+            </w:pPr>
+          </w:p>
+          <w:p>
+            <w:pPr>
+              <w:spacing w:after="0" w:line="240" w:lineRule="auto"/>
+              <w:rPr>
+                <w:rFonts w:ascii="Arial Narrow" w:hAnsi="Arial Narrow" w:cs="Arial"/>
+                <w:lang w:val="en-US"/>
+              </w:rPr>
+            </w:pPr>
+            <w:r>
+              <w:rPr>
+                <w:rFonts w:ascii="Arial Narrow" w:hAnsi="Arial Narrow" w:cs="Arial"/>
+                <w:lang w:val="en-US"/>
+              </w:rPr>
+              <w:t>void TIM2_IRQHandler(void)</w:t>
+            </w:r>
+          </w:p>
+          <w:p>
+            <w:pPr>
+              <w:spacing w:after="0" w:line="240" w:lineRule="auto"/>
+              <w:rPr>
+                <w:rFonts w:ascii="Arial Narrow" w:hAnsi="Arial Narrow" w:cs="Arial"/>
+                <w:lang w:val="en-US"/>
+              </w:rPr>
+            </w:pPr>
+            <w:r>
+              <w:rPr>
+                <w:rFonts w:ascii="Arial Narrow" w:hAnsi="Arial Narrow" w:cs="Arial"/>
+                <w:lang w:val="en-US"/>
+              </w:rPr>
+              <w:t>{</w:t>
+            </w:r>
+          </w:p>
+          <w:p>
+            <w:pPr>
+              <w:spacing w:after="0" w:line="240" w:lineRule="auto"/>
+              <w:rPr>
+                <w:rFonts w:ascii="Arial Narrow" w:hAnsi="Arial Narrow" w:cs="Arial"/>
+                <w:lang w:val="en-US"/>
+              </w:rPr>
+            </w:pPr>
+            <w:r>
+              <w:rPr>
+                <w:rFonts w:ascii="Arial Narrow" w:hAnsi="Arial Narrow" w:cs="Arial"/>
+                <w:lang w:val="en-US"/>
+              </w:rPr>
+              <w:t xml:space="preserve">  // Number of elements in input vector and filter</w:t>
+            </w:r>
+          </w:p>
+          <w:p>
+            <w:pPr>
+              <w:spacing w:after="0" w:line="240" w:lineRule="auto"/>
+              <w:rPr>
+                <w:rFonts w:ascii="Arial Narrow" w:hAnsi="Arial Narrow" w:cs="Arial"/>
+                <w:lang w:val="en-US"/>
+              </w:rPr>
+            </w:pPr>
+            <w:r>
+              <w:rPr>
+                <w:rFonts w:ascii="Arial Narrow" w:hAnsi="Arial Narrow" w:cs="Arial"/>
+                <w:lang w:val="en-US"/>
+              </w:rPr>
+              <w:t xml:space="preserve">  int32_t     K = 3;</w:t>
+            </w:r>
+          </w:p>
+          <w:p>
+            <w:pPr>
+              <w:spacing w:after="0" w:line="240" w:lineRule="auto"/>
+              <w:rPr>
+                <w:rFonts w:ascii="Arial Narrow" w:hAnsi="Arial Narrow" w:cs="Arial"/>
+                <w:lang w:val="en-US"/>
+              </w:rPr>
+            </w:pPr>
+          </w:p>
+          <w:p>
+            <w:pPr>
+              <w:spacing w:after="0" w:line="240" w:lineRule="auto"/>
+              <w:rPr>
+                <w:rFonts w:ascii="Arial Narrow" w:hAnsi="Arial Narrow" w:cs="Arial"/>
+                <w:lang w:val="en-US"/>
+              </w:rPr>
+            </w:pPr>
+            <w:r>
+              <w:rPr>
+                <w:rFonts w:ascii="Arial Narrow" w:hAnsi="Arial Narrow" w:cs="Arial"/>
+                <w:lang w:val="en-US"/>
+              </w:rPr>
+              <w:t xml:space="preserve">  // Inputs vector</w:t>
+            </w:r>
+          </w:p>
+          <w:p>
+            <w:pPr>
+              <w:spacing w:after="0" w:line="240" w:lineRule="auto"/>
+              <w:rPr>
+                <w:rFonts w:ascii="Arial Narrow" w:hAnsi="Arial Narrow" w:cs="Arial"/>
+                <w:lang w:val="en-US"/>
+              </w:rPr>
+            </w:pPr>
+            <w:r>
+              <w:rPr>
+                <w:rFonts w:ascii="Arial Narrow" w:hAnsi="Arial Narrow" w:cs="Arial"/>
+                <w:lang w:val="en-US"/>
+              </w:rPr>
+              <w:t xml:space="preserve">  static double </w:t>
+            </w:r>
+            <w:proofErr w:type="gramStart"/>
+            <w:r>
+              <w:rPr>
+                <w:rFonts w:ascii="Arial Narrow" w:hAnsi="Arial Narrow" w:cs="Arial"/>
+                <w:lang w:val="en-US"/>
+              </w:rPr>
+              <w:t>X[</w:t>
+            </w:r>
+            <w:proofErr w:type="gramEnd"/>
+            <w:r>
+              <w:rPr>
+                <w:rFonts w:ascii="Arial Narrow" w:hAnsi="Arial Narrow" w:cs="Arial"/>
+                <w:lang w:val="en-US"/>
+              </w:rPr>
+              <w:t>3] = {};</w:t>
+            </w:r>
+          </w:p>
+          <w:p>
+            <w:pPr>
+              <w:spacing w:after="0" w:line="240" w:lineRule="auto"/>
+              <w:rPr>
+                <w:rFonts w:ascii="Arial Narrow" w:hAnsi="Arial Narrow" w:cs="Arial"/>
+                <w:lang w:val="en-US"/>
+              </w:rPr>
+            </w:pPr>
+          </w:p>
+          <w:p>
+            <w:pPr>
+              <w:spacing w:after="0" w:line="240" w:lineRule="auto"/>
+              <w:rPr>
+                <w:rFonts w:ascii="Arial Narrow" w:hAnsi="Arial Narrow" w:cs="Arial"/>
+                <w:lang w:val="en-US"/>
+              </w:rPr>
+            </w:pPr>
+            <w:r>
+              <w:rPr>
+                <w:rFonts w:ascii="Arial Narrow" w:hAnsi="Arial Narrow" w:cs="Arial"/>
+                <w:lang w:val="en-US"/>
+              </w:rPr>
+              <w:t xml:space="preserve">  // Filter coefficients</w:t>
+            </w:r>
+          </w:p>
+          <w:p>
+            <w:pPr>
+              <w:spacing w:after="0" w:line="240" w:lineRule="auto"/>
+              <w:rPr>
+                <w:rFonts w:ascii="Arial Narrow" w:hAnsi="Arial Narrow" w:cs="Arial"/>
+                <w:lang w:val="en-US"/>
+              </w:rPr>
+            </w:pPr>
+            <w:r>
+              <w:rPr>
+                <w:rFonts w:ascii="Arial Narrow" w:hAnsi="Arial Narrow" w:cs="Arial"/>
+                <w:lang w:val="en-US"/>
+              </w:rPr>
+              <w:t xml:space="preserve">  static double </w:t>
+            </w:r>
+            <w:proofErr w:type="gramStart"/>
+            <w:r>
+              <w:rPr>
+                <w:rFonts w:ascii="Arial Narrow" w:hAnsi="Arial Narrow" w:cs="Arial"/>
+                <w:lang w:val="en-US"/>
+              </w:rPr>
+              <w:t>B[</w:t>
+            </w:r>
+            <w:proofErr w:type="gramEnd"/>
+            <w:r>
+              <w:rPr>
+                <w:rFonts w:ascii="Arial Narrow" w:hAnsi="Arial Narrow" w:cs="Arial"/>
+                <w:lang w:val="en-US"/>
+              </w:rPr>
+              <w:t>3] = {1.0, 0.0, 0.0};</w:t>
+            </w:r>
+          </w:p>
+          <w:p>
+            <w:pPr>
+              <w:spacing w:after="0" w:line="240" w:lineRule="auto"/>
+              <w:rPr>
+                <w:rFonts w:ascii="Arial Narrow" w:hAnsi="Arial Narrow" w:cs="Arial"/>
+                <w:lang w:val="en-US"/>
+              </w:rPr>
+            </w:pPr>
+          </w:p>
+          <w:p>
+            <w:pPr>
+              <w:spacing w:after="0" w:line="240" w:lineRule="auto"/>
+              <w:rPr>
+                <w:rFonts w:ascii="Arial Narrow" w:hAnsi="Arial Narrow" w:cs="Arial"/>
+                <w:lang w:val="en-US"/>
+              </w:rPr>
+            </w:pPr>
+            <w:r>
+              <w:rPr>
+                <w:rFonts w:ascii="Arial Narrow" w:hAnsi="Arial Narrow" w:cs="Arial"/>
+                <w:lang w:val="en-US"/>
+              </w:rPr>
+              <w:t xml:space="preserve">  // Output per sample</w:t>
+            </w:r>
+          </w:p>
+          <w:p>
+            <w:pPr>
+              <w:spacing w:after="0" w:line="240" w:lineRule="auto"/>
+              <w:rPr>
+                <w:rFonts w:ascii="Arial Narrow" w:hAnsi="Arial Narrow" w:cs="Arial"/>
+                <w:lang w:val="en-US"/>
+              </w:rPr>
+            </w:pPr>
+            <w:r>
+              <w:rPr>
+                <w:rFonts w:ascii="Arial Narrow" w:hAnsi="Arial Narrow" w:cs="Arial"/>
+                <w:lang w:val="en-US"/>
+              </w:rPr>
+              <w:t xml:space="preserve">  double y = 0.0;</w:t>
+            </w:r>
+          </w:p>
+          <w:p>
+            <w:pPr>
+              <w:spacing w:after="0" w:line="240" w:lineRule="auto"/>
+              <w:rPr>
+                <w:rFonts w:ascii="Arial Narrow" w:hAnsi="Arial Narrow" w:cs="Arial"/>
+                <w:lang w:val="en-US"/>
+              </w:rPr>
+            </w:pPr>
+          </w:p>
+          <w:p>
+            <w:pPr>
+              <w:spacing w:after="0" w:line="240" w:lineRule="auto"/>
+              <w:rPr>
+                <w:rFonts w:ascii="Arial Narrow" w:hAnsi="Arial Narrow" w:cs="Arial"/>
+                <w:lang w:val="en-US"/>
+              </w:rPr>
+            </w:pPr>
+            <w:r>
+              <w:rPr>
+                <w:rFonts w:ascii="Arial Narrow" w:hAnsi="Arial Narrow" w:cs="Arial"/>
+                <w:lang w:val="en-US"/>
+              </w:rPr>
+              <w:t xml:space="preserve">  // Index of new input sample</w:t>
+            </w:r>
+          </w:p>
+          <w:p>
+            <w:pPr>
+              <w:spacing w:after="0" w:line="240" w:lineRule="auto"/>
+              <w:rPr>
+                <w:rFonts w:ascii="Arial Narrow" w:hAnsi="Arial Narrow" w:cs="Arial"/>
+                <w:lang w:val="en-US"/>
+              </w:rPr>
+            </w:pPr>
+            <w:r>
+              <w:rPr>
+                <w:rFonts w:ascii="Arial Narrow" w:hAnsi="Arial Narrow" w:cs="Arial"/>
+                <w:lang w:val="en-US"/>
+              </w:rPr>
+              <w:t xml:space="preserve">  static int32_t </w:t>
+            </w:r>
+            <w:proofErr w:type="spellStart"/>
+            <w:r>
+              <w:rPr>
+                <w:rFonts w:ascii="Arial Narrow" w:hAnsi="Arial Narrow" w:cs="Arial"/>
+                <w:lang w:val="en-US"/>
+              </w:rPr>
+              <w:t>xZero</w:t>
+            </w:r>
+            <w:proofErr w:type="spellEnd"/>
+            <w:r>
+              <w:rPr>
+                <w:rFonts w:ascii="Arial Narrow" w:hAnsi="Arial Narrow" w:cs="Arial"/>
+                <w:lang w:val="en-US"/>
+              </w:rPr>
+              <w:t xml:space="preserve"> = 0;</w:t>
+            </w:r>
+          </w:p>
+          <w:p>
+            <w:pPr>
+              <w:spacing w:after="0" w:line="240" w:lineRule="auto"/>
+              <w:rPr>
+                <w:rFonts w:ascii="Arial Narrow" w:hAnsi="Arial Narrow" w:cs="Arial"/>
+                <w:lang w:val="en-US"/>
+              </w:rPr>
+            </w:pPr>
+          </w:p>
+          <w:p>
+            <w:pPr>
+              <w:spacing w:after="0" w:line="240" w:lineRule="auto"/>
+              <w:rPr>
+                <w:rFonts w:ascii="Arial Narrow" w:hAnsi="Arial Narrow" w:cs="Arial"/>
+                <w:lang w:val="en-US"/>
+              </w:rPr>
+            </w:pPr>
+            <w:r>
+              <w:rPr>
+                <w:rFonts w:ascii="Arial Narrow" w:hAnsi="Arial Narrow" w:cs="Arial"/>
+                <w:lang w:val="en-US"/>
+              </w:rPr>
+              <w:t xml:space="preserve">  // Counter for the number of elements in the inputs vector</w:t>
+            </w:r>
+          </w:p>
+          <w:p>
+            <w:pPr>
+              <w:spacing w:after="0" w:line="240" w:lineRule="auto"/>
+              <w:rPr>
+                <w:rFonts w:ascii="Arial Narrow" w:hAnsi="Arial Narrow" w:cs="Arial"/>
+                <w:lang w:val="en-US"/>
+              </w:rPr>
+            </w:pPr>
+            <w:r>
+              <w:rPr>
+                <w:rFonts w:ascii="Arial Narrow" w:hAnsi="Arial Narrow" w:cs="Arial"/>
+                <w:lang w:val="en-US"/>
+              </w:rPr>
+              <w:t xml:space="preserve">  int32_t     k = 0;</w:t>
+            </w:r>
+          </w:p>
+          <w:p>
+            <w:pPr>
+              <w:spacing w:after="0" w:line="240" w:lineRule="auto"/>
+              <w:rPr>
+                <w:rFonts w:ascii="Arial Narrow" w:hAnsi="Arial Narrow" w:cs="Arial"/>
+                <w:lang w:val="en-US"/>
+              </w:rPr>
+            </w:pPr>
+          </w:p>
+          <w:p>
+            <w:pPr>
+              <w:spacing w:after="0" w:line="240" w:lineRule="auto"/>
+              <w:rPr>
+                <w:rFonts w:ascii="Arial Narrow" w:hAnsi="Arial Narrow" w:cs="Arial"/>
+                <w:lang w:val="en-US"/>
+              </w:rPr>
+            </w:pPr>
+            <w:r>
+              <w:rPr>
+                <w:rFonts w:ascii="Arial Narrow" w:hAnsi="Arial Narrow" w:cs="Arial"/>
+                <w:lang w:val="en-US"/>
+              </w:rPr>
+              <w:t xml:space="preserve">  TIM2-&gt;SR &amp;= ~TIM_SR_UIF;</w:t>
+            </w:r>
+          </w:p>
+          <w:p>
+            <w:pPr>
+              <w:spacing w:after="0" w:line="240" w:lineRule="auto"/>
+              <w:rPr>
+                <w:rFonts w:ascii="Arial Narrow" w:hAnsi="Arial Narrow" w:cs="Arial"/>
+                <w:lang w:val="es-419"/>
+              </w:rPr>
+            </w:pPr>
             <w:r>
               <w:rPr>
                 <w:rFonts w:ascii="Arial Narrow" w:hAnsi="Arial Narrow" w:cs="Arial"/>
@@ -2606,53 +2948,60 @@
               </w:rPr>
               <w:t xml:space="preserve">  </w:t>
             </w:r>
-          </w:p>
-          <w:p>
-            <w:pPr>
-              <w:spacing w:after="0" w:line="240" w:lineRule="auto"/>
-              <w:rPr>
-                <w:rFonts w:ascii="Arial Narrow" w:hAnsi="Arial Narrow" w:cs="Arial"/>
-                <w:lang w:val="en-US"/>
-              </w:rPr>
-            </w:pPr>
-            <w:r>
-              <w:rPr>
-                <w:rFonts w:ascii="Arial Narrow" w:hAnsi="Arial Narrow" w:cs="Arial"/>
-                <w:lang w:val="en-US"/>
-              </w:rPr>
-              <w:t xml:space="preserve">  while (1)</w:t>
-            </w:r>
-          </w:p>
-          <w:p>
-            <w:pPr>
-              <w:spacing w:after="0" w:line="240" w:lineRule="auto"/>
-              <w:rPr>
-                <w:rFonts w:ascii="Arial Narrow" w:hAnsi="Arial Narrow" w:cs="Arial"/>
-                <w:lang w:val="en-US"/>
-              </w:rPr>
-            </w:pPr>
-            <w:r>
-              <w:rPr>
-                <w:rFonts w:ascii="Arial Narrow" w:hAnsi="Arial Narrow" w:cs="Arial"/>
-                <w:lang w:val="en-US"/>
-              </w:rPr>
-              <w:t xml:space="preserve">  {</w:t>
-            </w:r>
-          </w:p>
-          <w:p>
-            <w:pPr>
-              <w:spacing w:after="0" w:line="240" w:lineRule="auto"/>
-              <w:rPr>
-                <w:rFonts w:ascii="Arial Narrow" w:hAnsi="Arial Narrow" w:cs="Arial"/>
-                <w:lang w:val="en-US"/>
-              </w:rPr>
-            </w:pPr>
-            <w:r>
-              <w:rPr>
-                <w:rFonts w:ascii="Arial Narrow" w:hAnsi="Arial Narrow" w:cs="Arial"/>
-                <w:lang w:val="en-US"/>
-              </w:rPr>
-              <w:t xml:space="preserve">    uint16_t x = </w:t>
+            <w:r>
+              <w:rPr>
+                <w:rFonts w:ascii="Arial Narrow" w:hAnsi="Arial Narrow" w:cs="Arial"/>
+                <w:lang w:val="es-419"/>
+              </w:rPr>
+              <w:t>GPIOB-&gt;ODR |= GPIO_ODR_OD2;</w:t>
+            </w:r>
+          </w:p>
+          <w:p>
+            <w:pPr>
+              <w:spacing w:after="0" w:line="240" w:lineRule="auto"/>
+              <w:rPr>
+                <w:rFonts w:ascii="Arial Narrow" w:hAnsi="Arial Narrow" w:cs="Arial"/>
+                <w:lang w:val="es-419"/>
+              </w:rPr>
+            </w:pPr>
+          </w:p>
+          <w:p>
+            <w:pPr>
+              <w:spacing w:after="0" w:line="240" w:lineRule="auto"/>
+              <w:rPr>
+                <w:rFonts w:ascii="Arial Narrow" w:hAnsi="Arial Narrow" w:cs="Arial"/>
+                <w:lang w:val="en-US"/>
+              </w:rPr>
+            </w:pPr>
+            <w:r>
+              <w:rPr>
+                <w:rFonts w:ascii="Arial Narrow" w:hAnsi="Arial Narrow" w:cs="Arial"/>
+                <w:lang w:val="es-419"/>
+              </w:rPr>
+              <w:t xml:space="preserve">  </w:t>
+            </w:r>
+            <w:r>
+              <w:rPr>
+                <w:rFonts w:ascii="Arial Narrow" w:hAnsi="Arial Narrow" w:cs="Arial"/>
+                <w:lang w:val="en-US"/>
+              </w:rPr>
+              <w:t>X[</w:t>
+            </w:r>
+            <w:proofErr w:type="spellStart"/>
+            <w:r>
+              <w:rPr>
+                <w:rFonts w:ascii="Arial Narrow" w:hAnsi="Arial Narrow" w:cs="Arial"/>
+                <w:lang w:val="en-US"/>
+              </w:rPr>
+              <w:t>xZero</w:t>
+            </w:r>
+            <w:proofErr w:type="spellEnd"/>
+            <w:r>
+              <w:rPr>
+                <w:rFonts w:ascii="Arial Narrow" w:hAnsi="Arial Narrow" w:cs="Arial"/>
+                <w:lang w:val="en-US"/>
+              </w:rPr>
+              <w:t>] = (double)</w:t>
             </w:r>
             <w:proofErr w:type="spellStart"/>
             <w:proofErr w:type="gramStart"/>
@@ -2669,7 +3018,7 @@
                 <w:rFonts w:ascii="Arial Narrow" w:hAnsi="Arial Narrow" w:cs="Arial"/>
                 <w:lang w:val="en-US"/>
               </w:rPr>
-              <w:t>(</w:t>
+              <w:t xml:space="preserve">();   </w:t>
             </w:r>
             <w:proofErr w:type="gramEnd"/>
             <w:r>
@@ -2677,24 +3026,281 @@
                 <w:rFonts w:ascii="Arial Narrow" w:hAnsi="Arial Narrow" w:cs="Arial"/>
                 <w:lang w:val="en-US"/>
               </w:rPr>
-              <w:t>);</w:t>
-            </w:r>
-          </w:p>
-          <w:p>
-            <w:pPr>
-              <w:spacing w:after="0" w:line="240" w:lineRule="auto"/>
-              <w:rPr>
-                <w:rFonts w:ascii="Arial Narrow" w:hAnsi="Arial Narrow" w:cs="Arial"/>
-                <w:lang w:val="en-US"/>
-              </w:rPr>
-            </w:pPr>
-            <w:r>
-              <w:rPr>
-                <w:rFonts w:ascii="Arial Narrow" w:hAnsi="Arial Narrow" w:cs="Arial"/>
-                <w:lang w:val="en-US"/>
-              </w:rPr>
-              <w:lastRenderedPageBreak/>
-              <w:t xml:space="preserve">    DAC1-&gt;DHR12R2 = x;  </w:t>
+              <w:t xml:space="preserve">// Save the new sample into the zero of the inputs </w:t>
+            </w:r>
+            <w:proofErr w:type="gramStart"/>
+            <w:r>
+              <w:rPr>
+                <w:rFonts w:ascii="Arial Narrow" w:hAnsi="Arial Narrow" w:cs="Arial"/>
+                <w:lang w:val="en-US"/>
+              </w:rPr>
+              <w:t>vector</w:t>
+            </w:r>
+            <w:proofErr w:type="gramEnd"/>
+          </w:p>
+          <w:p>
+            <w:pPr>
+              <w:spacing w:after="0" w:line="240" w:lineRule="auto"/>
+              <w:rPr>
+                <w:rFonts w:ascii="Arial Narrow" w:hAnsi="Arial Narrow" w:cs="Arial"/>
+                <w:lang w:val="en-US"/>
+              </w:rPr>
+            </w:pPr>
+            <w:r>
+              <w:rPr>
+                <w:rFonts w:ascii="Arial Narrow" w:hAnsi="Arial Narrow" w:cs="Arial"/>
+                <w:lang w:val="en-US"/>
+              </w:rPr>
+              <w:t xml:space="preserve">  y = 0.0;</w:t>
+            </w:r>
+          </w:p>
+          <w:p>
+            <w:pPr>
+              <w:spacing w:after="0" w:line="240" w:lineRule="auto"/>
+              <w:rPr>
+                <w:rFonts w:ascii="Arial Narrow" w:hAnsi="Arial Narrow" w:cs="Arial"/>
+                <w:lang w:val="en-US"/>
+              </w:rPr>
+            </w:pPr>
+            <w:r>
+              <w:rPr>
+                <w:rFonts w:ascii="Arial Narrow" w:hAnsi="Arial Narrow" w:cs="Arial"/>
+                <w:lang w:val="en-US"/>
+              </w:rPr>
+              <w:t xml:space="preserve">  </w:t>
+            </w:r>
+            <w:proofErr w:type="gramStart"/>
+            <w:r>
+              <w:rPr>
+                <w:rFonts w:ascii="Arial Narrow" w:hAnsi="Arial Narrow" w:cs="Arial"/>
+                <w:lang w:val="en-US"/>
+              </w:rPr>
+              <w:t>for( k</w:t>
+            </w:r>
+            <w:proofErr w:type="gramEnd"/>
+            <w:r>
+              <w:rPr>
+                <w:rFonts w:ascii="Arial Narrow" w:hAnsi="Arial Narrow" w:cs="Arial"/>
+                <w:lang w:val="en-US"/>
+              </w:rPr>
+              <w:t>=0; k&lt;K; k+</w:t>
+            </w:r>
+            <w:proofErr w:type="gramStart"/>
+            <w:r>
+              <w:rPr>
+                <w:rFonts w:ascii="Arial Narrow" w:hAnsi="Arial Narrow" w:cs="Arial"/>
+                <w:lang w:val="en-US"/>
+              </w:rPr>
+              <w:t>+ )</w:t>
+            </w:r>
+            <w:proofErr w:type="gramEnd"/>
+            <w:r>
+              <w:rPr>
+                <w:rFonts w:ascii="Arial Narrow" w:hAnsi="Arial Narrow" w:cs="Arial"/>
+                <w:lang w:val="en-US"/>
+              </w:rPr>
+              <w:t xml:space="preserve">    // Make convolution between the filter vector and inputs vector</w:t>
+            </w:r>
+          </w:p>
+          <w:p>
+            <w:pPr>
+              <w:spacing w:after="0" w:line="240" w:lineRule="auto"/>
+              <w:rPr>
+                <w:rFonts w:ascii="Arial Narrow" w:hAnsi="Arial Narrow" w:cs="Arial"/>
+                <w:lang w:val="en-US"/>
+              </w:rPr>
+            </w:pPr>
+            <w:r>
+              <w:rPr>
+                <w:rFonts w:ascii="Arial Narrow" w:hAnsi="Arial Narrow" w:cs="Arial"/>
+                <w:lang w:val="en-US"/>
+              </w:rPr>
+              <w:t xml:space="preserve">  {</w:t>
+            </w:r>
+          </w:p>
+          <w:p>
+            <w:pPr>
+              <w:spacing w:after="0" w:line="240" w:lineRule="auto"/>
+              <w:rPr>
+                <w:rFonts w:ascii="Arial Narrow" w:hAnsi="Arial Narrow" w:cs="Arial"/>
+                <w:lang w:val="en-US"/>
+              </w:rPr>
+            </w:pPr>
+            <w:r>
+              <w:rPr>
+                <w:rFonts w:ascii="Arial Narrow" w:hAnsi="Arial Narrow" w:cs="Arial"/>
+                <w:lang w:val="en-US"/>
+              </w:rPr>
+              <w:t xml:space="preserve">    y += X[</w:t>
+            </w:r>
+            <w:proofErr w:type="spellStart"/>
+            <w:r>
+              <w:rPr>
+                <w:rFonts w:ascii="Arial Narrow" w:hAnsi="Arial Narrow" w:cs="Arial"/>
+                <w:lang w:val="en-US"/>
+              </w:rPr>
+              <w:t>xZero</w:t>
+            </w:r>
+            <w:proofErr w:type="spellEnd"/>
+            <w:r>
+              <w:rPr>
+                <w:rFonts w:ascii="Arial Narrow" w:hAnsi="Arial Narrow" w:cs="Arial"/>
+                <w:lang w:val="en-US"/>
+              </w:rPr>
+              <w:t>]*B[k];</w:t>
+            </w:r>
+          </w:p>
+          <w:p>
+            <w:pPr>
+              <w:spacing w:after="0" w:line="240" w:lineRule="auto"/>
+              <w:rPr>
+                <w:rFonts w:ascii="Arial Narrow" w:hAnsi="Arial Narrow" w:cs="Arial"/>
+                <w:lang w:val="en-US"/>
+              </w:rPr>
+            </w:pPr>
+            <w:r>
+              <w:rPr>
+                <w:rFonts w:ascii="Arial Narrow" w:hAnsi="Arial Narrow" w:cs="Arial"/>
+                <w:lang w:val="en-US"/>
+              </w:rPr>
+              <w:t xml:space="preserve">    </w:t>
+            </w:r>
+            <w:proofErr w:type="gramStart"/>
+            <w:r>
+              <w:rPr>
+                <w:rFonts w:ascii="Arial Narrow" w:hAnsi="Arial Narrow" w:cs="Arial"/>
+                <w:lang w:val="en-US"/>
+              </w:rPr>
+              <w:t>if( --</w:t>
+            </w:r>
+            <w:proofErr w:type="spellStart"/>
+            <w:proofErr w:type="gramEnd"/>
+            <w:r>
+              <w:rPr>
+                <w:rFonts w:ascii="Arial Narrow" w:hAnsi="Arial Narrow" w:cs="Arial"/>
+                <w:lang w:val="en-US"/>
+              </w:rPr>
+              <w:t>xZero</w:t>
+            </w:r>
+            <w:proofErr w:type="spellEnd"/>
+            <w:r>
+              <w:rPr>
+                <w:rFonts w:ascii="Arial Narrow" w:hAnsi="Arial Narrow" w:cs="Arial"/>
+                <w:lang w:val="en-US"/>
+              </w:rPr>
+              <w:t xml:space="preserve"> &lt; </w:t>
+            </w:r>
+            <w:proofErr w:type="gramStart"/>
+            <w:r>
+              <w:rPr>
+                <w:rFonts w:ascii="Arial Narrow" w:hAnsi="Arial Narrow" w:cs="Arial"/>
+                <w:lang w:val="en-US"/>
+              </w:rPr>
+              <w:t>0 )</w:t>
+            </w:r>
+            <w:proofErr w:type="gramEnd"/>
+            <w:r>
+              <w:rPr>
+                <w:rFonts w:ascii="Arial Narrow" w:hAnsi="Arial Narrow" w:cs="Arial"/>
+                <w:lang w:val="en-US"/>
+              </w:rPr>
+              <w:t xml:space="preserve">     // Traverse circularly the inputs vector.</w:t>
+            </w:r>
+          </w:p>
+          <w:p>
+            <w:pPr>
+              <w:spacing w:after="0" w:line="240" w:lineRule="auto"/>
+              <w:rPr>
+                <w:rFonts w:ascii="Arial Narrow" w:hAnsi="Arial Narrow" w:cs="Arial"/>
+                <w:lang w:val="en-US"/>
+              </w:rPr>
+            </w:pPr>
+            <w:r>
+              <w:rPr>
+                <w:rFonts w:ascii="Arial Narrow" w:hAnsi="Arial Narrow" w:cs="Arial"/>
+                <w:lang w:val="en-US"/>
+              </w:rPr>
+              <w:t xml:space="preserve">                              // If going before the index zero, set index</w:t>
+            </w:r>
+          </w:p>
+          <w:p>
+            <w:pPr>
+              <w:spacing w:after="0" w:line="240" w:lineRule="auto"/>
+              <w:rPr>
+                <w:rFonts w:ascii="Arial Narrow" w:hAnsi="Arial Narrow" w:cs="Arial"/>
+                <w:lang w:val="en-US"/>
+              </w:rPr>
+            </w:pPr>
+            <w:r>
+              <w:rPr>
+                <w:rFonts w:ascii="Arial Narrow" w:hAnsi="Arial Narrow" w:cs="Arial"/>
+                <w:lang w:val="en-US"/>
+              </w:rPr>
+              <w:t xml:space="preserve">                              // to the greatest one inside the vector</w:t>
+            </w:r>
+          </w:p>
+          <w:p>
+            <w:pPr>
+              <w:spacing w:after="0" w:line="240" w:lineRule="auto"/>
+              <w:rPr>
+                <w:rFonts w:ascii="Arial Narrow" w:hAnsi="Arial Narrow" w:cs="Arial"/>
+                <w:lang w:val="en-US"/>
+              </w:rPr>
+            </w:pPr>
+            <w:r>
+              <w:rPr>
+                <w:rFonts w:ascii="Arial Narrow" w:hAnsi="Arial Narrow" w:cs="Arial"/>
+                <w:lang w:val="en-US"/>
+              </w:rPr>
+              <w:t xml:space="preserve">    {</w:t>
+            </w:r>
+          </w:p>
+          <w:p>
+            <w:pPr>
+              <w:spacing w:after="0" w:line="240" w:lineRule="auto"/>
+              <w:rPr>
+                <w:rFonts w:ascii="Arial Narrow" w:hAnsi="Arial Narrow" w:cs="Arial"/>
+                <w:lang w:val="en-US"/>
+              </w:rPr>
+            </w:pPr>
+            <w:r>
+              <w:rPr>
+                <w:rFonts w:ascii="Arial Narrow" w:hAnsi="Arial Narrow" w:cs="Arial"/>
+                <w:lang w:val="en-US"/>
+              </w:rPr>
+              <w:t xml:space="preserve">      </w:t>
+            </w:r>
+            <w:proofErr w:type="spellStart"/>
+            <w:r>
+              <w:rPr>
+                <w:rFonts w:ascii="Arial Narrow" w:hAnsi="Arial Narrow" w:cs="Arial"/>
+                <w:lang w:val="en-US"/>
+              </w:rPr>
+              <w:t>xZero</w:t>
+            </w:r>
+            <w:proofErr w:type="spellEnd"/>
+            <w:r>
+              <w:rPr>
+                <w:rFonts w:ascii="Arial Narrow" w:hAnsi="Arial Narrow" w:cs="Arial"/>
+                <w:lang w:val="en-US"/>
+              </w:rPr>
+              <w:t xml:space="preserve"> = K - 1;</w:t>
+            </w:r>
+          </w:p>
+          <w:p>
+            <w:pPr>
+              <w:spacing w:after="0" w:line="240" w:lineRule="auto"/>
+              <w:rPr>
+                <w:rFonts w:ascii="Arial Narrow" w:hAnsi="Arial Narrow" w:cs="Arial"/>
+                <w:lang w:val="en-US"/>
+              </w:rPr>
+            </w:pPr>
+            <w:r>
+              <w:rPr>
+                <w:rFonts w:ascii="Arial Narrow" w:hAnsi="Arial Narrow" w:cs="Arial"/>
+                <w:lang w:val="en-US"/>
+              </w:rPr>
+              <w:t xml:space="preserve">    }</w:t>
             </w:r>
           </w:p>
           <w:p>
@@ -2726,6 +3332,362 @@
                 <w:rFonts w:ascii="Arial Narrow" w:hAnsi="Arial Narrow" w:cs="Arial"/>
                 <w:lang w:val="en-US"/>
               </w:rPr>
+              <w:t xml:space="preserve">  </w:t>
+            </w:r>
+            <w:proofErr w:type="gramStart"/>
+            <w:r>
+              <w:rPr>
+                <w:rFonts w:ascii="Arial Narrow" w:hAnsi="Arial Narrow" w:cs="Arial"/>
+                <w:lang w:val="en-US"/>
+              </w:rPr>
+              <w:t>if( +</w:t>
+            </w:r>
+            <w:proofErr w:type="gramEnd"/>
+            <w:r>
+              <w:rPr>
+                <w:rFonts w:ascii="Arial Narrow" w:hAnsi="Arial Narrow" w:cs="Arial"/>
+                <w:lang w:val="en-US"/>
+              </w:rPr>
+              <w:t>+</w:t>
+            </w:r>
+            <w:proofErr w:type="spellStart"/>
+            <w:r>
+              <w:rPr>
+                <w:rFonts w:ascii="Arial Narrow" w:hAnsi="Arial Narrow" w:cs="Arial"/>
+                <w:lang w:val="en-US"/>
+              </w:rPr>
+              <w:t>xZero</w:t>
+            </w:r>
+            <w:proofErr w:type="spellEnd"/>
+            <w:r>
+              <w:rPr>
+                <w:rFonts w:ascii="Arial Narrow" w:hAnsi="Arial Narrow" w:cs="Arial"/>
+                <w:lang w:val="en-US"/>
+              </w:rPr>
+              <w:t xml:space="preserve"> &gt; K - </w:t>
+            </w:r>
+            <w:proofErr w:type="gramStart"/>
+            <w:r>
+              <w:rPr>
+                <w:rFonts w:ascii="Arial Narrow" w:hAnsi="Arial Narrow" w:cs="Arial"/>
+                <w:lang w:val="en-US"/>
+              </w:rPr>
+              <w:t>1 )</w:t>
+            </w:r>
+            <w:proofErr w:type="gramEnd"/>
+            <w:r>
+              <w:rPr>
+                <w:rFonts w:ascii="Arial Narrow" w:hAnsi="Arial Narrow" w:cs="Arial"/>
+                <w:lang w:val="en-US"/>
+              </w:rPr>
+              <w:t xml:space="preserve">   // Set a new </w:t>
+            </w:r>
+            <w:proofErr w:type="spellStart"/>
+            <w:r>
+              <w:rPr>
+                <w:rFonts w:ascii="Arial Narrow" w:hAnsi="Arial Narrow" w:cs="Arial"/>
+                <w:lang w:val="en-US"/>
+              </w:rPr>
+              <w:t>xZero</w:t>
+            </w:r>
+            <w:proofErr w:type="spellEnd"/>
+            <w:r>
+              <w:rPr>
+                <w:rFonts w:ascii="Arial Narrow" w:hAnsi="Arial Narrow" w:cs="Arial"/>
+                <w:lang w:val="en-US"/>
+              </w:rPr>
+              <w:t xml:space="preserve"> value in order to save next sample</w:t>
+            </w:r>
+          </w:p>
+          <w:p>
+            <w:pPr>
+              <w:spacing w:after="0" w:line="240" w:lineRule="auto"/>
+              <w:rPr>
+                <w:rFonts w:ascii="Arial Narrow" w:hAnsi="Arial Narrow" w:cs="Arial"/>
+                <w:lang w:val="en-US"/>
+              </w:rPr>
+            </w:pPr>
+            <w:r>
+              <w:rPr>
+                <w:rFonts w:ascii="Arial Narrow" w:hAnsi="Arial Narrow" w:cs="Arial"/>
+                <w:lang w:val="en-US"/>
+              </w:rPr>
+              <w:t xml:space="preserve">                              // If going after the greatest index in the array, set</w:t>
+            </w:r>
+          </w:p>
+          <w:p>
+            <w:pPr>
+              <w:spacing w:after="0" w:line="240" w:lineRule="auto"/>
+              <w:rPr>
+                <w:rFonts w:ascii="Arial Narrow" w:hAnsi="Arial Narrow" w:cs="Arial"/>
+                <w:lang w:val="en-US"/>
+              </w:rPr>
+            </w:pPr>
+            <w:r>
+              <w:rPr>
+                <w:rFonts w:ascii="Arial Narrow" w:hAnsi="Arial Narrow" w:cs="Arial"/>
+                <w:lang w:val="en-US"/>
+              </w:rPr>
+              <w:t xml:space="preserve">                              // index to zero</w:t>
+            </w:r>
+          </w:p>
+          <w:p>
+            <w:pPr>
+              <w:spacing w:after="0" w:line="240" w:lineRule="auto"/>
+              <w:rPr>
+                <w:rFonts w:ascii="Arial Narrow" w:hAnsi="Arial Narrow" w:cs="Arial"/>
+                <w:lang w:val="en-US"/>
+              </w:rPr>
+            </w:pPr>
+            <w:r>
+              <w:rPr>
+                <w:rFonts w:ascii="Arial Narrow" w:hAnsi="Arial Narrow" w:cs="Arial"/>
+                <w:lang w:val="en-US"/>
+              </w:rPr>
+              <w:t xml:space="preserve">  {</w:t>
+            </w:r>
+          </w:p>
+          <w:p>
+            <w:pPr>
+              <w:spacing w:after="0" w:line="240" w:lineRule="auto"/>
+              <w:rPr>
+                <w:rFonts w:ascii="Arial Narrow" w:hAnsi="Arial Narrow" w:cs="Arial"/>
+                <w:lang w:val="en-US"/>
+              </w:rPr>
+            </w:pPr>
+            <w:r>
+              <w:rPr>
+                <w:rFonts w:ascii="Arial Narrow" w:hAnsi="Arial Narrow" w:cs="Arial"/>
+                <w:lang w:val="en-US"/>
+              </w:rPr>
+              <w:t xml:space="preserve">    </w:t>
+            </w:r>
+            <w:proofErr w:type="spellStart"/>
+            <w:r>
+              <w:rPr>
+                <w:rFonts w:ascii="Arial Narrow" w:hAnsi="Arial Narrow" w:cs="Arial"/>
+                <w:lang w:val="en-US"/>
+              </w:rPr>
+              <w:t>xZero</w:t>
+            </w:r>
+            <w:proofErr w:type="spellEnd"/>
+            <w:r>
+              <w:rPr>
+                <w:rFonts w:ascii="Arial Narrow" w:hAnsi="Arial Narrow" w:cs="Arial"/>
+                <w:lang w:val="en-US"/>
+              </w:rPr>
+              <w:t xml:space="preserve"> = 0;</w:t>
+            </w:r>
+          </w:p>
+          <w:p>
+            <w:pPr>
+              <w:spacing w:after="0" w:line="240" w:lineRule="auto"/>
+              <w:rPr>
+                <w:rFonts w:ascii="Arial Narrow" w:hAnsi="Arial Narrow" w:cs="Arial"/>
+                <w:lang w:val="en-US"/>
+              </w:rPr>
+            </w:pPr>
+            <w:r>
+              <w:rPr>
+                <w:rFonts w:ascii="Arial Narrow" w:hAnsi="Arial Narrow" w:cs="Arial"/>
+                <w:lang w:val="en-US"/>
+              </w:rPr>
+              <w:t xml:space="preserve">  }</w:t>
+            </w:r>
+          </w:p>
+          <w:p>
+            <w:pPr>
+              <w:spacing w:after="0" w:line="240" w:lineRule="auto"/>
+              <w:rPr>
+                <w:rFonts w:ascii="Arial Narrow" w:hAnsi="Arial Narrow" w:cs="Arial"/>
+                <w:lang w:val="en-US"/>
+              </w:rPr>
+            </w:pPr>
+          </w:p>
+          <w:p>
+            <w:pPr>
+              <w:spacing w:after="0" w:line="240" w:lineRule="auto"/>
+              <w:rPr>
+                <w:rFonts w:ascii="Arial Narrow" w:hAnsi="Arial Narrow" w:cs="Arial"/>
+                <w:lang w:val="en-US"/>
+              </w:rPr>
+            </w:pPr>
+            <w:r>
+              <w:rPr>
+                <w:rFonts w:ascii="Arial Narrow" w:hAnsi="Arial Narrow" w:cs="Arial"/>
+                <w:lang w:val="en-US"/>
+              </w:rPr>
+              <w:t xml:space="preserve">  </w:t>
+            </w:r>
+            <w:proofErr w:type="gramStart"/>
+            <w:r>
+              <w:rPr>
+                <w:rFonts w:ascii="Arial Narrow" w:hAnsi="Arial Narrow" w:cs="Arial"/>
+                <w:lang w:val="en-US"/>
+              </w:rPr>
+              <w:t>if(</w:t>
+            </w:r>
+            <w:proofErr w:type="gramEnd"/>
+            <w:r>
+              <w:rPr>
+                <w:rFonts w:ascii="Arial Narrow" w:hAnsi="Arial Narrow" w:cs="Arial"/>
+                <w:lang w:val="en-US"/>
+              </w:rPr>
+              <w:t>y &gt; 4095.0)</w:t>
+            </w:r>
+          </w:p>
+          <w:p>
+            <w:pPr>
+              <w:spacing w:after="0" w:line="240" w:lineRule="auto"/>
+              <w:rPr>
+                <w:rFonts w:ascii="Arial Narrow" w:hAnsi="Arial Narrow" w:cs="Arial"/>
+                <w:lang w:val="en-US"/>
+              </w:rPr>
+            </w:pPr>
+            <w:r>
+              <w:rPr>
+                <w:rFonts w:ascii="Arial Narrow" w:hAnsi="Arial Narrow" w:cs="Arial"/>
+                <w:lang w:val="en-US"/>
+              </w:rPr>
+              <w:t xml:space="preserve">      y = 4095.0;</w:t>
+            </w:r>
+          </w:p>
+          <w:p>
+            <w:pPr>
+              <w:spacing w:after="0" w:line="240" w:lineRule="auto"/>
+              <w:rPr>
+                <w:rFonts w:ascii="Arial Narrow" w:hAnsi="Arial Narrow" w:cs="Arial"/>
+                <w:lang w:val="en-US"/>
+              </w:rPr>
+            </w:pPr>
+            <w:r>
+              <w:rPr>
+                <w:rFonts w:ascii="Arial Narrow" w:hAnsi="Arial Narrow" w:cs="Arial"/>
+                <w:lang w:val="en-US"/>
+              </w:rPr>
+              <w:t xml:space="preserve">  else </w:t>
+            </w:r>
+            <w:proofErr w:type="gramStart"/>
+            <w:r>
+              <w:rPr>
+                <w:rFonts w:ascii="Arial Narrow" w:hAnsi="Arial Narrow" w:cs="Arial"/>
+                <w:lang w:val="en-US"/>
+              </w:rPr>
+              <w:t>if(</w:t>
+            </w:r>
+            <w:proofErr w:type="gramEnd"/>
+            <w:r>
+              <w:rPr>
+                <w:rFonts w:ascii="Arial Narrow" w:hAnsi="Arial Narrow" w:cs="Arial"/>
+                <w:lang w:val="en-US"/>
+              </w:rPr>
+              <w:t>y &lt; 0.0)</w:t>
+            </w:r>
+          </w:p>
+          <w:p>
+            <w:pPr>
+              <w:spacing w:after="0" w:line="240" w:lineRule="auto"/>
+              <w:rPr>
+                <w:rFonts w:ascii="Arial Narrow" w:hAnsi="Arial Narrow" w:cs="Arial"/>
+                <w:lang w:val="en-US"/>
+              </w:rPr>
+            </w:pPr>
+            <w:r>
+              <w:rPr>
+                <w:rFonts w:ascii="Arial Narrow" w:hAnsi="Arial Narrow" w:cs="Arial"/>
+                <w:lang w:val="en-US"/>
+              </w:rPr>
+              <w:t xml:space="preserve">      y = 0.0;</w:t>
+            </w:r>
+          </w:p>
+          <w:p>
+            <w:pPr>
+              <w:spacing w:after="0" w:line="240" w:lineRule="auto"/>
+              <w:rPr>
+                <w:rFonts w:ascii="Arial Narrow" w:hAnsi="Arial Narrow" w:cs="Arial"/>
+                <w:lang w:val="en-US"/>
+              </w:rPr>
+            </w:pPr>
+          </w:p>
+          <w:p>
+            <w:pPr>
+              <w:spacing w:after="0" w:line="240" w:lineRule="auto"/>
+              <w:rPr>
+                <w:rFonts w:ascii="Arial Narrow" w:hAnsi="Arial Narrow" w:cs="Arial"/>
+                <w:lang w:val="en-US"/>
+              </w:rPr>
+            </w:pPr>
+          </w:p>
+          <w:p>
+            <w:pPr>
+              <w:spacing w:after="0" w:line="240" w:lineRule="auto"/>
+              <w:rPr>
+                <w:rFonts w:ascii="Arial Narrow" w:hAnsi="Arial Narrow" w:cs="Arial"/>
+                <w:lang w:val="en-US"/>
+              </w:rPr>
+            </w:pPr>
+            <w:r>
+              <w:rPr>
+                <w:rFonts w:ascii="Arial Narrow" w:hAnsi="Arial Narrow" w:cs="Arial"/>
+                <w:lang w:val="en-US"/>
+              </w:rPr>
+              <w:t xml:space="preserve">  DAC1-&gt;DHR12R2 = (uint16_</w:t>
+            </w:r>
+            <w:proofErr w:type="gramStart"/>
+            <w:r>
+              <w:rPr>
+                <w:rFonts w:ascii="Arial Narrow" w:hAnsi="Arial Narrow" w:cs="Arial"/>
+                <w:lang w:val="en-US"/>
+              </w:rPr>
+              <w:t>t)y</w:t>
+            </w:r>
+            <w:proofErr w:type="gramEnd"/>
+            <w:r>
+              <w:rPr>
+                <w:rFonts w:ascii="Arial Narrow" w:hAnsi="Arial Narrow" w:cs="Arial"/>
+                <w:lang w:val="en-US"/>
+              </w:rPr>
+              <w:t>;</w:t>
+            </w:r>
+          </w:p>
+          <w:p>
+            <w:pPr>
+              <w:spacing w:after="0" w:line="240" w:lineRule="auto"/>
+              <w:rPr>
+                <w:rFonts w:ascii="Arial Narrow" w:hAnsi="Arial Narrow" w:cs="Arial"/>
+                <w:lang w:val="en-US"/>
+              </w:rPr>
+            </w:pPr>
+          </w:p>
+          <w:p>
+            <w:pPr>
+              <w:spacing w:after="0" w:line="240" w:lineRule="auto"/>
+              <w:rPr>
+                <w:rFonts w:ascii="Arial Narrow" w:hAnsi="Arial Narrow" w:cs="Arial"/>
+                <w:lang w:val="en-US"/>
+              </w:rPr>
+            </w:pPr>
+            <w:r>
+              <w:rPr>
+                <w:rFonts w:ascii="Arial Narrow" w:hAnsi="Arial Narrow" w:cs="Arial"/>
+                <w:lang w:val="en-US"/>
+              </w:rPr>
+              <w:t xml:space="preserve">  GPIOB-&gt;ODR &amp;= ~GPIO_ODR_OD2;</w:t>
+            </w:r>
+          </w:p>
+          <w:p>
+            <w:pPr>
+              <w:spacing w:after="0" w:line="240" w:lineRule="auto"/>
+              <w:rPr>
+                <w:rFonts w:ascii="Arial Narrow" w:hAnsi="Arial Narrow" w:cs="Arial"/>
+                <w:lang w:val="en-US"/>
+              </w:rPr>
+            </w:pPr>
+            <w:r>
+              <w:rPr>
+                <w:rFonts w:ascii="Arial Narrow" w:hAnsi="Arial Narrow" w:cs="Arial"/>
+                <w:lang w:val="en-US"/>
+              </w:rPr>
               <w:t>}</w:t>
             </w:r>
           </w:p>
@@ -2751,404 +3713,7 @@
                 <w:rFonts w:ascii="Arial Narrow" w:hAnsi="Arial Narrow" w:cs="Arial"/>
                 <w:lang w:val="en-US"/>
               </w:rPr>
-              <w:t>void TIM2_IRQHandler(void)</w:t>
-            </w:r>
-          </w:p>
-          <w:p>
-            <w:pPr>
-              <w:spacing w:after="0" w:line="240" w:lineRule="auto"/>
-              <w:rPr>
-                <w:rFonts w:ascii="Arial Narrow" w:hAnsi="Arial Narrow" w:cs="Arial"/>
-                <w:lang w:val="en-US"/>
-              </w:rPr>
-            </w:pPr>
-            <w:r>
-              <w:rPr>
-                <w:rFonts w:ascii="Arial Narrow" w:hAnsi="Arial Narrow" w:cs="Arial"/>
-                <w:lang w:val="en-US"/>
-              </w:rPr>
-              <w:t>{</w:t>
-            </w:r>
-          </w:p>
-          <w:p>
-            <w:pPr>
-              <w:spacing w:after="0" w:line="240" w:lineRule="auto"/>
-              <w:rPr>
-                <w:rFonts w:ascii="Arial Narrow" w:hAnsi="Arial Narrow" w:cs="Arial"/>
-                <w:lang w:val="en-US"/>
-              </w:rPr>
-            </w:pPr>
-            <w:r>
-              <w:rPr>
-                <w:rFonts w:ascii="Arial Narrow" w:hAnsi="Arial Narrow" w:cs="Arial"/>
-                <w:lang w:val="en-US"/>
-              </w:rPr>
-              <w:t xml:space="preserve">  // Number of elements in input vector and filter</w:t>
-            </w:r>
-          </w:p>
-          <w:p>
-            <w:pPr>
-              <w:spacing w:after="0" w:line="240" w:lineRule="auto"/>
-              <w:rPr>
-                <w:rFonts w:ascii="Arial Narrow" w:hAnsi="Arial Narrow" w:cs="Arial"/>
-                <w:lang w:val="en-US"/>
-              </w:rPr>
-            </w:pPr>
-            <w:r>
-              <w:rPr>
-                <w:rFonts w:ascii="Arial Narrow" w:hAnsi="Arial Narrow" w:cs="Arial"/>
-                <w:lang w:val="en-US"/>
-              </w:rPr>
-              <w:t xml:space="preserve">  int32_t     K = 3;</w:t>
-            </w:r>
-          </w:p>
-          <w:p>
-            <w:pPr>
-              <w:spacing w:after="0" w:line="240" w:lineRule="auto"/>
-              <w:rPr>
-                <w:rFonts w:ascii="Arial Narrow" w:hAnsi="Arial Narrow" w:cs="Arial"/>
-                <w:lang w:val="en-US"/>
-              </w:rPr>
-            </w:pPr>
-          </w:p>
-          <w:p>
-            <w:pPr>
-              <w:spacing w:after="0" w:line="240" w:lineRule="auto"/>
-              <w:rPr>
-                <w:rFonts w:ascii="Arial Narrow" w:hAnsi="Arial Narrow" w:cs="Arial"/>
-                <w:lang w:val="en-US"/>
-              </w:rPr>
-            </w:pPr>
-            <w:r>
-              <w:rPr>
-                <w:rFonts w:ascii="Arial Narrow" w:hAnsi="Arial Narrow" w:cs="Arial"/>
-                <w:lang w:val="en-US"/>
-              </w:rPr>
-              <w:t xml:space="preserve">  // Inputs vector</w:t>
-            </w:r>
-          </w:p>
-          <w:p>
-            <w:pPr>
-              <w:spacing w:after="0" w:line="240" w:lineRule="auto"/>
-              <w:rPr>
-                <w:rFonts w:ascii="Arial Narrow" w:hAnsi="Arial Narrow" w:cs="Arial"/>
-                <w:lang w:val="en-US"/>
-              </w:rPr>
-            </w:pPr>
-            <w:r>
-              <w:rPr>
-                <w:rFonts w:ascii="Arial Narrow" w:hAnsi="Arial Narrow" w:cs="Arial"/>
-                <w:lang w:val="en-US"/>
-              </w:rPr>
-              <w:t xml:space="preserve">  static float </w:t>
-            </w:r>
-            <w:proofErr w:type="gramStart"/>
-            <w:r>
-              <w:rPr>
-                <w:rFonts w:ascii="Arial Narrow" w:hAnsi="Arial Narrow" w:cs="Arial"/>
-                <w:lang w:val="en-US"/>
-              </w:rPr>
-              <w:t>X[</w:t>
-            </w:r>
-            <w:proofErr w:type="gramEnd"/>
-            <w:r>
-              <w:rPr>
-                <w:rFonts w:ascii="Arial Narrow" w:hAnsi="Arial Narrow" w:cs="Arial"/>
-                <w:lang w:val="en-US"/>
-              </w:rPr>
-              <w:t>3] = {};</w:t>
-            </w:r>
-          </w:p>
-          <w:p>
-            <w:pPr>
-              <w:spacing w:after="0" w:line="240" w:lineRule="auto"/>
-              <w:rPr>
-                <w:rFonts w:ascii="Arial Narrow" w:hAnsi="Arial Narrow" w:cs="Arial"/>
-                <w:lang w:val="en-US"/>
-              </w:rPr>
-            </w:pPr>
-          </w:p>
-          <w:p>
-            <w:pPr>
-              <w:spacing w:after="0" w:line="240" w:lineRule="auto"/>
-              <w:rPr>
-                <w:rFonts w:ascii="Arial Narrow" w:hAnsi="Arial Narrow" w:cs="Arial"/>
-                <w:lang w:val="en-US"/>
-              </w:rPr>
-            </w:pPr>
-            <w:r>
-              <w:rPr>
-                <w:rFonts w:ascii="Arial Narrow" w:hAnsi="Arial Narrow" w:cs="Arial"/>
-                <w:lang w:val="en-US"/>
-              </w:rPr>
-              <w:t xml:space="preserve">  // Filter coefficients</w:t>
-            </w:r>
-          </w:p>
-          <w:p>
-            <w:pPr>
-              <w:spacing w:after="0" w:line="240" w:lineRule="auto"/>
-              <w:rPr>
-                <w:rFonts w:ascii="Arial Narrow" w:hAnsi="Arial Narrow" w:cs="Arial"/>
-                <w:lang w:val="en-US"/>
-              </w:rPr>
-            </w:pPr>
-            <w:r>
-              <w:rPr>
-                <w:rFonts w:ascii="Arial Narrow" w:hAnsi="Arial Narrow" w:cs="Arial"/>
-                <w:lang w:val="en-US"/>
-              </w:rPr>
-              <w:t xml:space="preserve">  static float </w:t>
-            </w:r>
-            <w:proofErr w:type="gramStart"/>
-            <w:r>
-              <w:rPr>
-                <w:rFonts w:ascii="Arial Narrow" w:hAnsi="Arial Narrow" w:cs="Arial"/>
-                <w:lang w:val="en-US"/>
-              </w:rPr>
-              <w:t>B[</w:t>
-            </w:r>
-            <w:proofErr w:type="gramEnd"/>
-            <w:r>
-              <w:rPr>
-                <w:rFonts w:ascii="Arial Narrow" w:hAnsi="Arial Narrow" w:cs="Arial"/>
-                <w:lang w:val="en-US"/>
-              </w:rPr>
-              <w:t>3] = {1.0, 0.0, 0.0};</w:t>
-            </w:r>
-          </w:p>
-          <w:p>
-            <w:pPr>
-              <w:spacing w:after="0" w:line="240" w:lineRule="auto"/>
-              <w:rPr>
-                <w:rFonts w:ascii="Arial Narrow" w:hAnsi="Arial Narrow" w:cs="Arial"/>
-                <w:lang w:val="en-US"/>
-              </w:rPr>
-            </w:pPr>
-          </w:p>
-          <w:p>
-            <w:pPr>
-              <w:spacing w:after="0" w:line="240" w:lineRule="auto"/>
-              <w:rPr>
-                <w:rFonts w:ascii="Arial Narrow" w:hAnsi="Arial Narrow" w:cs="Arial"/>
-                <w:lang w:val="en-US"/>
-              </w:rPr>
-            </w:pPr>
-            <w:r>
-              <w:rPr>
-                <w:rFonts w:ascii="Arial Narrow" w:hAnsi="Arial Narrow" w:cs="Arial"/>
-                <w:lang w:val="en-US"/>
-              </w:rPr>
-              <w:t xml:space="preserve">  // Output per sample</w:t>
-            </w:r>
-          </w:p>
-          <w:p>
-            <w:pPr>
-              <w:spacing w:after="0" w:line="240" w:lineRule="auto"/>
-              <w:rPr>
-                <w:rFonts w:ascii="Arial Narrow" w:hAnsi="Arial Narrow" w:cs="Arial"/>
-                <w:lang w:val="en-US"/>
-              </w:rPr>
-            </w:pPr>
-            <w:r>
-              <w:rPr>
-                <w:rFonts w:ascii="Arial Narrow" w:hAnsi="Arial Narrow" w:cs="Arial"/>
-                <w:lang w:val="en-US"/>
-              </w:rPr>
-              <w:t xml:space="preserve">  float y = 0.0;</w:t>
-            </w:r>
-          </w:p>
-          <w:p>
-            <w:pPr>
-              <w:spacing w:after="0" w:line="240" w:lineRule="auto"/>
-              <w:rPr>
-                <w:rFonts w:ascii="Arial Narrow" w:hAnsi="Arial Narrow" w:cs="Arial"/>
-                <w:lang w:val="en-US"/>
-              </w:rPr>
-            </w:pPr>
-          </w:p>
-          <w:p>
-            <w:pPr>
-              <w:spacing w:after="0" w:line="240" w:lineRule="auto"/>
-              <w:rPr>
-                <w:rFonts w:ascii="Arial Narrow" w:hAnsi="Arial Narrow" w:cs="Arial"/>
-                <w:lang w:val="en-US"/>
-              </w:rPr>
-            </w:pPr>
-            <w:r>
-              <w:rPr>
-                <w:rFonts w:ascii="Arial Narrow" w:hAnsi="Arial Narrow" w:cs="Arial"/>
-                <w:lang w:val="en-US"/>
-              </w:rPr>
-              <w:t xml:space="preserve">  // Index of new input sample</w:t>
-            </w:r>
-          </w:p>
-          <w:p>
-            <w:pPr>
-              <w:spacing w:after="0" w:line="240" w:lineRule="auto"/>
-              <w:rPr>
-                <w:rFonts w:ascii="Arial Narrow" w:hAnsi="Arial Narrow" w:cs="Arial"/>
-                <w:lang w:val="en-US"/>
-              </w:rPr>
-            </w:pPr>
-            <w:r>
-              <w:rPr>
-                <w:rFonts w:ascii="Arial Narrow" w:hAnsi="Arial Narrow" w:cs="Arial"/>
-                <w:lang w:val="en-US"/>
-              </w:rPr>
-              <w:t xml:space="preserve">  static int32_t </w:t>
-            </w:r>
-            <w:proofErr w:type="spellStart"/>
-            <w:r>
-              <w:rPr>
-                <w:rFonts w:ascii="Arial Narrow" w:hAnsi="Arial Narrow" w:cs="Arial"/>
-                <w:lang w:val="en-US"/>
-              </w:rPr>
-              <w:t>xZero</w:t>
-            </w:r>
-            <w:proofErr w:type="spellEnd"/>
-            <w:r>
-              <w:rPr>
-                <w:rFonts w:ascii="Arial Narrow" w:hAnsi="Arial Narrow" w:cs="Arial"/>
-                <w:lang w:val="en-US"/>
-              </w:rPr>
-              <w:t xml:space="preserve"> = 0;</w:t>
-            </w:r>
-          </w:p>
-          <w:p>
-            <w:pPr>
-              <w:spacing w:after="0" w:line="240" w:lineRule="auto"/>
-              <w:rPr>
-                <w:rFonts w:ascii="Arial Narrow" w:hAnsi="Arial Narrow" w:cs="Arial"/>
-                <w:lang w:val="en-US"/>
-              </w:rPr>
-            </w:pPr>
-          </w:p>
-          <w:p>
-            <w:pPr>
-              <w:spacing w:after="0" w:line="240" w:lineRule="auto"/>
-              <w:rPr>
-                <w:rFonts w:ascii="Arial Narrow" w:hAnsi="Arial Narrow" w:cs="Arial"/>
-                <w:lang w:val="en-US"/>
-              </w:rPr>
-            </w:pPr>
-            <w:r>
-              <w:rPr>
-                <w:rFonts w:ascii="Arial Narrow" w:hAnsi="Arial Narrow" w:cs="Arial"/>
-                <w:lang w:val="en-US"/>
-              </w:rPr>
-              <w:t xml:space="preserve">  // Counter for the number of elements in the inputs vector</w:t>
-            </w:r>
-          </w:p>
-          <w:p>
-            <w:pPr>
-              <w:spacing w:after="0" w:line="240" w:lineRule="auto"/>
-              <w:rPr>
-                <w:rFonts w:ascii="Arial Narrow" w:hAnsi="Arial Narrow" w:cs="Arial"/>
-                <w:lang w:val="en-US"/>
-              </w:rPr>
-            </w:pPr>
-            <w:r>
-              <w:rPr>
-                <w:rFonts w:ascii="Arial Narrow" w:hAnsi="Arial Narrow" w:cs="Arial"/>
-                <w:lang w:val="en-US"/>
-              </w:rPr>
-              <w:t xml:space="preserve">  int32_t     k = 0;</w:t>
-            </w:r>
-          </w:p>
-          <w:p>
-            <w:pPr>
-              <w:spacing w:after="0" w:line="240" w:lineRule="auto"/>
-              <w:rPr>
-                <w:rFonts w:ascii="Arial Narrow" w:hAnsi="Arial Narrow" w:cs="Arial"/>
-                <w:lang w:val="en-US"/>
-              </w:rPr>
-            </w:pPr>
-          </w:p>
-          <w:p>
-            <w:pPr>
-              <w:spacing w:after="0" w:line="240" w:lineRule="auto"/>
-              <w:rPr>
-                <w:rFonts w:ascii="Arial Narrow" w:hAnsi="Arial Narrow" w:cs="Arial"/>
-                <w:lang w:val="en-US"/>
-              </w:rPr>
-            </w:pPr>
-            <w:r>
-              <w:rPr>
-                <w:rFonts w:ascii="Arial Narrow" w:hAnsi="Arial Narrow" w:cs="Arial"/>
-                <w:lang w:val="en-US"/>
-              </w:rPr>
-              <w:t xml:space="preserve">  TIM2-&gt;SR &amp;= ~TIM_SR_UIF;</w:t>
-            </w:r>
-          </w:p>
-          <w:p>
-            <w:pPr>
-              <w:spacing w:after="0" w:line="240" w:lineRule="auto"/>
-              <w:rPr>
-                <w:rFonts w:ascii="Arial Narrow" w:hAnsi="Arial Narrow" w:cs="Arial"/>
-                <w:lang w:val="es-419"/>
-              </w:rPr>
-            </w:pPr>
-            <w:r>
-              <w:rPr>
-                <w:rFonts w:ascii="Arial Narrow" w:hAnsi="Arial Narrow" w:cs="Arial"/>
-                <w:lang w:val="en-US"/>
-              </w:rPr>
-              <w:t xml:space="preserve">  </w:t>
-            </w:r>
-            <w:r>
-              <w:rPr>
-                <w:rFonts w:ascii="Arial Narrow" w:hAnsi="Arial Narrow" w:cs="Arial"/>
-                <w:lang w:val="es-419"/>
-              </w:rPr>
-              <w:t>GPIOB-&gt;ODR |= GPIO_ODR_OD2;</w:t>
-            </w:r>
-          </w:p>
-          <w:p>
-            <w:pPr>
-              <w:spacing w:after="0" w:line="240" w:lineRule="auto"/>
-              <w:rPr>
-                <w:rFonts w:ascii="Arial Narrow" w:hAnsi="Arial Narrow" w:cs="Arial"/>
-                <w:lang w:val="es-419"/>
-              </w:rPr>
-            </w:pPr>
-          </w:p>
-          <w:p>
-            <w:pPr>
-              <w:spacing w:after="0" w:line="240" w:lineRule="auto"/>
-              <w:rPr>
-                <w:rFonts w:ascii="Arial Narrow" w:hAnsi="Arial Narrow" w:cs="Arial"/>
-                <w:lang w:val="en-US"/>
-              </w:rPr>
-            </w:pPr>
-            <w:r>
-              <w:rPr>
-                <w:rFonts w:ascii="Arial Narrow" w:hAnsi="Arial Narrow" w:cs="Arial"/>
-                <w:lang w:val="es-419"/>
-              </w:rPr>
-              <w:t xml:space="preserve">  </w:t>
-            </w:r>
-            <w:r>
-              <w:rPr>
-                <w:rFonts w:ascii="Arial Narrow" w:hAnsi="Arial Narrow" w:cs="Arial"/>
-                <w:lang w:val="en-US"/>
-              </w:rPr>
-              <w:t>X[</w:t>
-            </w:r>
-            <w:proofErr w:type="spellStart"/>
-            <w:r>
-              <w:rPr>
-                <w:rFonts w:ascii="Arial Narrow" w:hAnsi="Arial Narrow" w:cs="Arial"/>
-                <w:lang w:val="en-US"/>
-              </w:rPr>
-              <w:t>xZero</w:t>
-            </w:r>
-            <w:proofErr w:type="spellEnd"/>
-            <w:r>
-              <w:rPr>
-                <w:rFonts w:ascii="Arial Narrow" w:hAnsi="Arial Narrow" w:cs="Arial"/>
-                <w:lang w:val="en-US"/>
-              </w:rPr>
-              <w:t>] = (float)</w:t>
+              <w:t xml:space="preserve">uint16_t </w:t>
             </w:r>
             <w:proofErr w:type="spellStart"/>
             <w:proofErr w:type="gramStart"/>
@@ -3165,709 +3730,6 @@
                 <w:rFonts w:ascii="Arial Narrow" w:hAnsi="Arial Narrow" w:cs="Arial"/>
                 <w:lang w:val="en-US"/>
               </w:rPr>
-              <w:t xml:space="preserve">();   </w:t>
-            </w:r>
-            <w:proofErr w:type="gramEnd"/>
-            <w:r>
-              <w:rPr>
-                <w:rFonts w:ascii="Arial Narrow" w:hAnsi="Arial Narrow" w:cs="Arial"/>
-                <w:lang w:val="en-US"/>
-              </w:rPr>
-              <w:t xml:space="preserve">// Save the new sample into the zero of the inputs </w:t>
-            </w:r>
-            <w:proofErr w:type="gramStart"/>
-            <w:r>
-              <w:rPr>
-                <w:rFonts w:ascii="Arial Narrow" w:hAnsi="Arial Narrow" w:cs="Arial"/>
-                <w:lang w:val="en-US"/>
-              </w:rPr>
-              <w:t>vector</w:t>
-            </w:r>
-            <w:proofErr w:type="gramEnd"/>
-          </w:p>
-          <w:p>
-            <w:pPr>
-              <w:spacing w:after="0" w:line="240" w:lineRule="auto"/>
-              <w:rPr>
-                <w:rFonts w:ascii="Arial Narrow" w:hAnsi="Arial Narrow" w:cs="Arial"/>
-                <w:lang w:val="en-US"/>
-              </w:rPr>
-            </w:pPr>
-            <w:r>
-              <w:rPr>
-                <w:rFonts w:ascii="Arial Narrow" w:hAnsi="Arial Narrow" w:cs="Arial"/>
-                <w:lang w:val="en-US"/>
-              </w:rPr>
-              <w:t xml:space="preserve">  y = 0.0;</w:t>
-            </w:r>
-          </w:p>
-          <w:p>
-            <w:pPr>
-              <w:spacing w:after="0" w:line="240" w:lineRule="auto"/>
-              <w:rPr>
-                <w:rFonts w:ascii="Arial Narrow" w:hAnsi="Arial Narrow" w:cs="Arial"/>
-                <w:lang w:val="en-US"/>
-              </w:rPr>
-            </w:pPr>
-            <w:r>
-              <w:rPr>
-                <w:rFonts w:ascii="Arial Narrow" w:hAnsi="Arial Narrow" w:cs="Arial"/>
-                <w:lang w:val="en-US"/>
-              </w:rPr>
-              <w:t xml:space="preserve">  </w:t>
-            </w:r>
-            <w:proofErr w:type="gramStart"/>
-            <w:r>
-              <w:rPr>
-                <w:rFonts w:ascii="Arial Narrow" w:hAnsi="Arial Narrow" w:cs="Arial"/>
-                <w:lang w:val="en-US"/>
-              </w:rPr>
-              <w:t>for( k</w:t>
-            </w:r>
-            <w:proofErr w:type="gramEnd"/>
-            <w:r>
-              <w:rPr>
-                <w:rFonts w:ascii="Arial Narrow" w:hAnsi="Arial Narrow" w:cs="Arial"/>
-                <w:lang w:val="en-US"/>
-              </w:rPr>
-              <w:t>=0; k&lt;K; k+</w:t>
-            </w:r>
-            <w:proofErr w:type="gramStart"/>
-            <w:r>
-              <w:rPr>
-                <w:rFonts w:ascii="Arial Narrow" w:hAnsi="Arial Narrow" w:cs="Arial"/>
-                <w:lang w:val="en-US"/>
-              </w:rPr>
-              <w:t>+ )</w:t>
-            </w:r>
-            <w:proofErr w:type="gramEnd"/>
-            <w:r>
-              <w:rPr>
-                <w:rFonts w:ascii="Arial Narrow" w:hAnsi="Arial Narrow" w:cs="Arial"/>
-                <w:lang w:val="en-US"/>
-              </w:rPr>
-              <w:t xml:space="preserve">    // Make convolution between the filter vector and inputs vector</w:t>
-            </w:r>
-          </w:p>
-          <w:p>
-            <w:pPr>
-              <w:spacing w:after="0" w:line="240" w:lineRule="auto"/>
-              <w:rPr>
-                <w:rFonts w:ascii="Arial Narrow" w:hAnsi="Arial Narrow" w:cs="Arial"/>
-                <w:lang w:val="en-US"/>
-              </w:rPr>
-            </w:pPr>
-            <w:r>
-              <w:rPr>
-                <w:rFonts w:ascii="Arial Narrow" w:hAnsi="Arial Narrow" w:cs="Arial"/>
-                <w:lang w:val="en-US"/>
-              </w:rPr>
-              <w:t xml:space="preserve">  {</w:t>
-            </w:r>
-          </w:p>
-          <w:p>
-            <w:pPr>
-              <w:spacing w:after="0" w:line="240" w:lineRule="auto"/>
-              <w:rPr>
-                <w:rFonts w:ascii="Arial Narrow" w:hAnsi="Arial Narrow" w:cs="Arial"/>
-                <w:lang w:val="en-US"/>
-              </w:rPr>
-            </w:pPr>
-            <w:r>
-              <w:rPr>
-                <w:rFonts w:ascii="Arial Narrow" w:hAnsi="Arial Narrow" w:cs="Arial"/>
-                <w:lang w:val="en-US"/>
-              </w:rPr>
-              <w:t xml:space="preserve">    y += X[</w:t>
-            </w:r>
-            <w:proofErr w:type="spellStart"/>
-            <w:r>
-              <w:rPr>
-                <w:rFonts w:ascii="Arial Narrow" w:hAnsi="Arial Narrow" w:cs="Arial"/>
-                <w:lang w:val="en-US"/>
-              </w:rPr>
-              <w:t>xZero</w:t>
-            </w:r>
-            <w:proofErr w:type="spellEnd"/>
-            <w:r>
-              <w:rPr>
-                <w:rFonts w:ascii="Arial Narrow" w:hAnsi="Arial Narrow" w:cs="Arial"/>
-                <w:lang w:val="en-US"/>
-              </w:rPr>
-              <w:t>]*B[k];</w:t>
-            </w:r>
-          </w:p>
-          <w:p>
-            <w:pPr>
-              <w:spacing w:after="0" w:line="240" w:lineRule="auto"/>
-              <w:rPr>
-                <w:rFonts w:ascii="Arial Narrow" w:hAnsi="Arial Narrow" w:cs="Arial"/>
-                <w:lang w:val="en-US"/>
-              </w:rPr>
-            </w:pPr>
-            <w:r>
-              <w:rPr>
-                <w:rFonts w:ascii="Arial Narrow" w:hAnsi="Arial Narrow" w:cs="Arial"/>
-                <w:lang w:val="en-US"/>
-              </w:rPr>
-              <w:t xml:space="preserve">    </w:t>
-            </w:r>
-            <w:proofErr w:type="gramStart"/>
-            <w:r>
-              <w:rPr>
-                <w:rFonts w:ascii="Arial Narrow" w:hAnsi="Arial Narrow" w:cs="Arial"/>
-                <w:lang w:val="en-US"/>
-              </w:rPr>
-              <w:t>if( --</w:t>
-            </w:r>
-            <w:proofErr w:type="spellStart"/>
-            <w:proofErr w:type="gramEnd"/>
-            <w:r>
-              <w:rPr>
-                <w:rFonts w:ascii="Arial Narrow" w:hAnsi="Arial Narrow" w:cs="Arial"/>
-                <w:lang w:val="en-US"/>
-              </w:rPr>
-              <w:t>xZero</w:t>
-            </w:r>
-            <w:proofErr w:type="spellEnd"/>
-            <w:r>
-              <w:rPr>
-                <w:rFonts w:ascii="Arial Narrow" w:hAnsi="Arial Narrow" w:cs="Arial"/>
-                <w:lang w:val="en-US"/>
-              </w:rPr>
-              <w:t xml:space="preserve"> &lt; </w:t>
-            </w:r>
-            <w:proofErr w:type="gramStart"/>
-            <w:r>
-              <w:rPr>
-                <w:rFonts w:ascii="Arial Narrow" w:hAnsi="Arial Narrow" w:cs="Arial"/>
-                <w:lang w:val="en-US"/>
-              </w:rPr>
-              <w:t>0 )</w:t>
-            </w:r>
-            <w:proofErr w:type="gramEnd"/>
-            <w:r>
-              <w:rPr>
-                <w:rFonts w:ascii="Arial Narrow" w:hAnsi="Arial Narrow" w:cs="Arial"/>
-                <w:lang w:val="en-US"/>
-              </w:rPr>
-              <w:t xml:space="preserve">     // Traverse circularly the inputs vector.</w:t>
-            </w:r>
-          </w:p>
-          <w:p>
-            <w:pPr>
-              <w:spacing w:after="0" w:line="240" w:lineRule="auto"/>
-              <w:rPr>
-                <w:rFonts w:ascii="Arial Narrow" w:hAnsi="Arial Narrow" w:cs="Arial"/>
-                <w:lang w:val="en-US"/>
-              </w:rPr>
-            </w:pPr>
-            <w:r>
-              <w:rPr>
-                <w:rFonts w:ascii="Arial Narrow" w:hAnsi="Arial Narrow" w:cs="Arial"/>
-                <w:lang w:val="en-US"/>
-              </w:rPr>
-              <w:t xml:space="preserve">                              // If going before the index zero, set index</w:t>
-            </w:r>
-          </w:p>
-          <w:p>
-            <w:pPr>
-              <w:spacing w:after="0" w:line="240" w:lineRule="auto"/>
-              <w:rPr>
-                <w:rFonts w:ascii="Arial Narrow" w:hAnsi="Arial Narrow" w:cs="Arial"/>
-                <w:lang w:val="en-US"/>
-              </w:rPr>
-            </w:pPr>
-            <w:r>
-              <w:rPr>
-                <w:rFonts w:ascii="Arial Narrow" w:hAnsi="Arial Narrow" w:cs="Arial"/>
-                <w:lang w:val="en-US"/>
-              </w:rPr>
-              <w:t xml:space="preserve">                              // to the greatest one inside the vector</w:t>
-            </w:r>
-          </w:p>
-          <w:p>
-            <w:pPr>
-              <w:spacing w:after="0" w:line="240" w:lineRule="auto"/>
-              <w:rPr>
-                <w:rFonts w:ascii="Arial Narrow" w:hAnsi="Arial Narrow" w:cs="Arial"/>
-                <w:lang w:val="en-US"/>
-              </w:rPr>
-            </w:pPr>
-            <w:r>
-              <w:rPr>
-                <w:rFonts w:ascii="Arial Narrow" w:hAnsi="Arial Narrow" w:cs="Arial"/>
-                <w:lang w:val="en-US"/>
-              </w:rPr>
-              <w:t xml:space="preserve">    {</w:t>
-            </w:r>
-          </w:p>
-          <w:p>
-            <w:pPr>
-              <w:spacing w:after="0" w:line="240" w:lineRule="auto"/>
-              <w:rPr>
-                <w:rFonts w:ascii="Arial Narrow" w:hAnsi="Arial Narrow" w:cs="Arial"/>
-                <w:lang w:val="en-US"/>
-              </w:rPr>
-            </w:pPr>
-            <w:r>
-              <w:rPr>
-                <w:rFonts w:ascii="Arial Narrow" w:hAnsi="Arial Narrow" w:cs="Arial"/>
-                <w:lang w:val="en-US"/>
-              </w:rPr>
-              <w:t xml:space="preserve">      </w:t>
-            </w:r>
-            <w:proofErr w:type="spellStart"/>
-            <w:r>
-              <w:rPr>
-                <w:rFonts w:ascii="Arial Narrow" w:hAnsi="Arial Narrow" w:cs="Arial"/>
-                <w:lang w:val="en-US"/>
-              </w:rPr>
-              <w:t>xZero</w:t>
-            </w:r>
-            <w:proofErr w:type="spellEnd"/>
-            <w:r>
-              <w:rPr>
-                <w:rFonts w:ascii="Arial Narrow" w:hAnsi="Arial Narrow" w:cs="Arial"/>
-                <w:lang w:val="en-US"/>
-              </w:rPr>
-              <w:t xml:space="preserve"> = K - 1;</w:t>
-            </w:r>
-          </w:p>
-          <w:p>
-            <w:pPr>
-              <w:spacing w:after="0" w:line="240" w:lineRule="auto"/>
-              <w:rPr>
-                <w:rFonts w:ascii="Arial Narrow" w:hAnsi="Arial Narrow" w:cs="Arial"/>
-                <w:lang w:val="en-US"/>
-              </w:rPr>
-            </w:pPr>
-            <w:r>
-              <w:rPr>
-                <w:rFonts w:ascii="Arial Narrow" w:hAnsi="Arial Narrow" w:cs="Arial"/>
-                <w:lang w:val="en-US"/>
-              </w:rPr>
-              <w:t xml:space="preserve">    }</w:t>
-            </w:r>
-          </w:p>
-          <w:p>
-            <w:pPr>
-              <w:spacing w:after="0" w:line="240" w:lineRule="auto"/>
-              <w:rPr>
-                <w:rFonts w:ascii="Arial Narrow" w:hAnsi="Arial Narrow" w:cs="Arial"/>
-                <w:lang w:val="en-US"/>
-              </w:rPr>
-            </w:pPr>
-            <w:r>
-              <w:rPr>
-                <w:rFonts w:ascii="Arial Narrow" w:hAnsi="Arial Narrow" w:cs="Arial"/>
-                <w:lang w:val="en-US"/>
-              </w:rPr>
-              <w:t xml:space="preserve">  }</w:t>
-            </w:r>
-          </w:p>
-          <w:p>
-            <w:pPr>
-              <w:spacing w:after="0" w:line="240" w:lineRule="auto"/>
-              <w:rPr>
-                <w:rFonts w:ascii="Arial Narrow" w:hAnsi="Arial Narrow" w:cs="Arial"/>
-                <w:lang w:val="en-US"/>
-              </w:rPr>
-            </w:pPr>
-            <w:r>
-              <w:rPr>
-                <w:rFonts w:ascii="Arial Narrow" w:hAnsi="Arial Narrow" w:cs="Arial"/>
-                <w:lang w:val="en-US"/>
-              </w:rPr>
-              <w:t xml:space="preserve">  </w:t>
-            </w:r>
-            <w:proofErr w:type="gramStart"/>
-            <w:r>
-              <w:rPr>
-                <w:rFonts w:ascii="Arial Narrow" w:hAnsi="Arial Narrow" w:cs="Arial"/>
-                <w:lang w:val="en-US"/>
-              </w:rPr>
-              <w:t>if( +</w:t>
-            </w:r>
-            <w:proofErr w:type="gramEnd"/>
-            <w:r>
-              <w:rPr>
-                <w:rFonts w:ascii="Arial Narrow" w:hAnsi="Arial Narrow" w:cs="Arial"/>
-                <w:lang w:val="en-US"/>
-              </w:rPr>
-              <w:t>+</w:t>
-            </w:r>
-            <w:proofErr w:type="spellStart"/>
-            <w:r>
-              <w:rPr>
-                <w:rFonts w:ascii="Arial Narrow" w:hAnsi="Arial Narrow" w:cs="Arial"/>
-                <w:lang w:val="en-US"/>
-              </w:rPr>
-              <w:t>xZero</w:t>
-            </w:r>
-            <w:proofErr w:type="spellEnd"/>
-            <w:r>
-              <w:rPr>
-                <w:rFonts w:ascii="Arial Narrow" w:hAnsi="Arial Narrow" w:cs="Arial"/>
-                <w:lang w:val="en-US"/>
-              </w:rPr>
-              <w:t xml:space="preserve"> &gt; K - </w:t>
-            </w:r>
-            <w:proofErr w:type="gramStart"/>
-            <w:r>
-              <w:rPr>
-                <w:rFonts w:ascii="Arial Narrow" w:hAnsi="Arial Narrow" w:cs="Arial"/>
-                <w:lang w:val="en-US"/>
-              </w:rPr>
-              <w:t>1 )</w:t>
-            </w:r>
-            <w:proofErr w:type="gramEnd"/>
-            <w:r>
-              <w:rPr>
-                <w:rFonts w:ascii="Arial Narrow" w:hAnsi="Arial Narrow" w:cs="Arial"/>
-                <w:lang w:val="en-US"/>
-              </w:rPr>
-              <w:t xml:space="preserve">   // Set a new </w:t>
-            </w:r>
-            <w:proofErr w:type="spellStart"/>
-            <w:r>
-              <w:rPr>
-                <w:rFonts w:ascii="Arial Narrow" w:hAnsi="Arial Narrow" w:cs="Arial"/>
-                <w:lang w:val="en-US"/>
-              </w:rPr>
-              <w:t>xZero</w:t>
-            </w:r>
-            <w:proofErr w:type="spellEnd"/>
-            <w:r>
-              <w:rPr>
-                <w:rFonts w:ascii="Arial Narrow" w:hAnsi="Arial Narrow" w:cs="Arial"/>
-                <w:lang w:val="en-US"/>
-              </w:rPr>
-              <w:t xml:space="preserve"> value in order to save next sample</w:t>
-            </w:r>
-          </w:p>
-          <w:p>
-            <w:pPr>
-              <w:spacing w:after="0" w:line="240" w:lineRule="auto"/>
-              <w:rPr>
-                <w:rFonts w:ascii="Arial Narrow" w:hAnsi="Arial Narrow" w:cs="Arial"/>
-                <w:lang w:val="en-US"/>
-              </w:rPr>
-            </w:pPr>
-            <w:r>
-              <w:rPr>
-                <w:rFonts w:ascii="Arial Narrow" w:hAnsi="Arial Narrow" w:cs="Arial"/>
-                <w:lang w:val="en-US"/>
-              </w:rPr>
-              <w:t xml:space="preserve">                              // If going after the greatest index in the array, set</w:t>
-            </w:r>
-          </w:p>
-          <w:p>
-            <w:pPr>
-              <w:spacing w:after="0" w:line="240" w:lineRule="auto"/>
-              <w:rPr>
-                <w:rFonts w:ascii="Arial Narrow" w:hAnsi="Arial Narrow" w:cs="Arial"/>
-                <w:lang w:val="en-US"/>
-              </w:rPr>
-            </w:pPr>
-            <w:r>
-              <w:rPr>
-                <w:rFonts w:ascii="Arial Narrow" w:hAnsi="Arial Narrow" w:cs="Arial"/>
-                <w:lang w:val="en-US"/>
-              </w:rPr>
-              <w:t xml:space="preserve">                              // index to zero</w:t>
-            </w:r>
-          </w:p>
-          <w:p>
-            <w:pPr>
-              <w:spacing w:after="0" w:line="240" w:lineRule="auto"/>
-              <w:rPr>
-                <w:rFonts w:ascii="Arial Narrow" w:hAnsi="Arial Narrow" w:cs="Arial"/>
-                <w:lang w:val="en-US"/>
-              </w:rPr>
-            </w:pPr>
-            <w:r>
-              <w:rPr>
-                <w:rFonts w:ascii="Arial Narrow" w:hAnsi="Arial Narrow" w:cs="Arial"/>
-                <w:lang w:val="en-US"/>
-              </w:rPr>
-              <w:t xml:space="preserve">  {</w:t>
-            </w:r>
-          </w:p>
-          <w:p>
-            <w:pPr>
-              <w:spacing w:after="0" w:line="240" w:lineRule="auto"/>
-              <w:rPr>
-                <w:rFonts w:ascii="Arial Narrow" w:hAnsi="Arial Narrow" w:cs="Arial"/>
-                <w:lang w:val="en-US"/>
-              </w:rPr>
-            </w:pPr>
-            <w:r>
-              <w:rPr>
-                <w:rFonts w:ascii="Arial Narrow" w:hAnsi="Arial Narrow" w:cs="Arial"/>
-                <w:lang w:val="en-US"/>
-              </w:rPr>
-              <w:t xml:space="preserve">    </w:t>
-            </w:r>
-            <w:proofErr w:type="spellStart"/>
-            <w:r>
-              <w:rPr>
-                <w:rFonts w:ascii="Arial Narrow" w:hAnsi="Arial Narrow" w:cs="Arial"/>
-                <w:lang w:val="en-US"/>
-              </w:rPr>
-              <w:t>xZero</w:t>
-            </w:r>
-            <w:proofErr w:type="spellEnd"/>
-            <w:r>
-              <w:rPr>
-                <w:rFonts w:ascii="Arial Narrow" w:hAnsi="Arial Narrow" w:cs="Arial"/>
-                <w:lang w:val="en-US"/>
-              </w:rPr>
-              <w:t xml:space="preserve"> = 0;</w:t>
-            </w:r>
-          </w:p>
-          <w:p>
-            <w:pPr>
-              <w:spacing w:after="0" w:line="240" w:lineRule="auto"/>
-              <w:rPr>
-                <w:rFonts w:ascii="Arial Narrow" w:hAnsi="Arial Narrow" w:cs="Arial"/>
-                <w:lang w:val="en-US"/>
-              </w:rPr>
-            </w:pPr>
-            <w:r>
-              <w:rPr>
-                <w:rFonts w:ascii="Arial Narrow" w:hAnsi="Arial Narrow" w:cs="Arial"/>
-                <w:lang w:val="en-US"/>
-              </w:rPr>
-              <w:t xml:space="preserve">  }</w:t>
-            </w:r>
-          </w:p>
-          <w:p>
-            <w:pPr>
-              <w:spacing w:after="0" w:line="240" w:lineRule="auto"/>
-              <w:rPr>
-                <w:rFonts w:ascii="Arial Narrow" w:hAnsi="Arial Narrow" w:cs="Arial"/>
-                <w:lang w:val="en-US"/>
-              </w:rPr>
-            </w:pPr>
-          </w:p>
-          <w:p>
-            <w:pPr>
-              <w:spacing w:after="0" w:line="240" w:lineRule="auto"/>
-              <w:rPr>
-                <w:rFonts w:ascii="Arial Narrow" w:hAnsi="Arial Narrow" w:cs="Arial"/>
-                <w:lang w:val="en-US"/>
-              </w:rPr>
-            </w:pPr>
-            <w:r>
-              <w:rPr>
-                <w:rFonts w:ascii="Arial Narrow" w:hAnsi="Arial Narrow" w:cs="Arial"/>
-                <w:lang w:val="en-US"/>
-              </w:rPr>
-              <w:t xml:space="preserve">  </w:t>
-            </w:r>
-            <w:proofErr w:type="gramStart"/>
-            <w:r>
-              <w:rPr>
-                <w:rFonts w:ascii="Arial Narrow" w:hAnsi="Arial Narrow" w:cs="Arial"/>
-                <w:lang w:val="en-US"/>
-              </w:rPr>
-              <w:t>if(</w:t>
-            </w:r>
-            <w:proofErr w:type="gramEnd"/>
-            <w:r>
-              <w:rPr>
-                <w:rFonts w:ascii="Arial Narrow" w:hAnsi="Arial Narrow" w:cs="Arial"/>
-                <w:lang w:val="en-US"/>
-              </w:rPr>
-              <w:t>y &gt; 4095.0)</w:t>
-            </w:r>
-          </w:p>
-          <w:p>
-            <w:pPr>
-              <w:spacing w:after="0" w:line="240" w:lineRule="auto"/>
-              <w:rPr>
-                <w:rFonts w:ascii="Arial Narrow" w:hAnsi="Arial Narrow" w:cs="Arial"/>
-                <w:lang w:val="en-US"/>
-              </w:rPr>
-            </w:pPr>
-            <w:r>
-              <w:rPr>
-                <w:rFonts w:ascii="Arial Narrow" w:hAnsi="Arial Narrow" w:cs="Arial"/>
-                <w:lang w:val="en-US"/>
-              </w:rPr>
-              <w:t xml:space="preserve">      y = 4095.0;</w:t>
-            </w:r>
-          </w:p>
-          <w:p>
-            <w:pPr>
-              <w:spacing w:after="0" w:line="240" w:lineRule="auto"/>
-              <w:rPr>
-                <w:rFonts w:ascii="Arial Narrow" w:hAnsi="Arial Narrow" w:cs="Arial"/>
-                <w:lang w:val="en-US"/>
-              </w:rPr>
-            </w:pPr>
-            <w:r>
-              <w:rPr>
-                <w:rFonts w:ascii="Arial Narrow" w:hAnsi="Arial Narrow" w:cs="Arial"/>
-                <w:lang w:val="en-US"/>
-              </w:rPr>
-              <w:t xml:space="preserve">  else </w:t>
-            </w:r>
-            <w:proofErr w:type="gramStart"/>
-            <w:r>
-              <w:rPr>
-                <w:rFonts w:ascii="Arial Narrow" w:hAnsi="Arial Narrow" w:cs="Arial"/>
-                <w:lang w:val="en-US"/>
-              </w:rPr>
-              <w:t>if(</w:t>
-            </w:r>
-            <w:proofErr w:type="gramEnd"/>
-            <w:r>
-              <w:rPr>
-                <w:rFonts w:ascii="Arial Narrow" w:hAnsi="Arial Narrow" w:cs="Arial"/>
-                <w:lang w:val="en-US"/>
-              </w:rPr>
-              <w:t>y &lt; 0.0)</w:t>
-            </w:r>
-          </w:p>
-          <w:p>
-            <w:pPr>
-              <w:spacing w:after="0" w:line="240" w:lineRule="auto"/>
-              <w:rPr>
-                <w:rFonts w:ascii="Arial Narrow" w:hAnsi="Arial Narrow" w:cs="Arial"/>
-                <w:lang w:val="en-US"/>
-              </w:rPr>
-            </w:pPr>
-            <w:r>
-              <w:rPr>
-                <w:rFonts w:ascii="Arial Narrow" w:hAnsi="Arial Narrow" w:cs="Arial"/>
-                <w:lang w:val="en-US"/>
-              </w:rPr>
-              <w:t xml:space="preserve">      y = 0.0;</w:t>
-            </w:r>
-          </w:p>
-          <w:p>
-            <w:pPr>
-              <w:spacing w:after="0" w:line="240" w:lineRule="auto"/>
-              <w:rPr>
-                <w:rFonts w:ascii="Arial Narrow" w:hAnsi="Arial Narrow" w:cs="Arial"/>
-                <w:lang w:val="en-US"/>
-              </w:rPr>
-            </w:pPr>
-          </w:p>
-          <w:p>
-            <w:pPr>
-              <w:spacing w:after="0" w:line="240" w:lineRule="auto"/>
-              <w:rPr>
-                <w:rFonts w:ascii="Arial Narrow" w:hAnsi="Arial Narrow" w:cs="Arial"/>
-                <w:lang w:val="en-US"/>
-              </w:rPr>
-            </w:pPr>
-            <w:r>
-              <w:rPr>
-                <w:rFonts w:ascii="Arial Narrow" w:hAnsi="Arial Narrow" w:cs="Arial"/>
-                <w:lang w:val="en-US"/>
-              </w:rPr>
-              <w:t xml:space="preserve">  DAC1-&gt;DHR12R2 = (uint16_</w:t>
-            </w:r>
-            <w:proofErr w:type="gramStart"/>
-            <w:r>
-              <w:rPr>
-                <w:rFonts w:ascii="Arial Narrow" w:hAnsi="Arial Narrow" w:cs="Arial"/>
-                <w:lang w:val="en-US"/>
-              </w:rPr>
-              <w:t>t)y</w:t>
-            </w:r>
-            <w:proofErr w:type="gramEnd"/>
-            <w:r>
-              <w:rPr>
-                <w:rFonts w:ascii="Arial Narrow" w:hAnsi="Arial Narrow" w:cs="Arial"/>
-                <w:lang w:val="en-US"/>
-              </w:rPr>
-              <w:t>;</w:t>
-            </w:r>
-          </w:p>
-          <w:p>
-            <w:pPr>
-              <w:spacing w:after="0" w:line="240" w:lineRule="auto"/>
-              <w:rPr>
-                <w:rFonts w:ascii="Arial Narrow" w:hAnsi="Arial Narrow" w:cs="Arial"/>
-                <w:lang w:val="en-US"/>
-              </w:rPr>
-            </w:pPr>
-          </w:p>
-          <w:p>
-            <w:pPr>
-              <w:spacing w:after="0" w:line="240" w:lineRule="auto"/>
-              <w:rPr>
-                <w:rFonts w:ascii="Arial Narrow" w:hAnsi="Arial Narrow" w:cs="Arial"/>
-                <w:lang w:val="en-US"/>
-              </w:rPr>
-            </w:pPr>
-            <w:r>
-              <w:rPr>
-                <w:rFonts w:ascii="Arial Narrow" w:hAnsi="Arial Narrow" w:cs="Arial"/>
-                <w:lang w:val="en-US"/>
-              </w:rPr>
-              <w:t xml:space="preserve">  GPIOB-&gt;ODR &amp;= ~GPIO_ODR_OD2;</w:t>
-            </w:r>
-          </w:p>
-          <w:p>
-            <w:pPr>
-              <w:spacing w:after="0" w:line="240" w:lineRule="auto"/>
-              <w:rPr>
-                <w:rFonts w:ascii="Arial Narrow" w:hAnsi="Arial Narrow" w:cs="Arial"/>
-                <w:lang w:val="en-US"/>
-              </w:rPr>
-            </w:pPr>
-            <w:r>
-              <w:rPr>
-                <w:rFonts w:ascii="Arial Narrow" w:hAnsi="Arial Narrow" w:cs="Arial"/>
-                <w:lang w:val="en-US"/>
-              </w:rPr>
-              <w:t>}</w:t>
-            </w:r>
-          </w:p>
-          <w:p>
-            <w:pPr>
-              <w:spacing w:after="0" w:line="240" w:lineRule="auto"/>
-              <w:rPr>
-                <w:rFonts w:ascii="Arial Narrow" w:hAnsi="Arial Narrow" w:cs="Arial"/>
-                <w:lang w:val="en-US"/>
-              </w:rPr>
-            </w:pPr>
-          </w:p>
-          <w:p>
-            <w:pPr>
-              <w:spacing w:after="0" w:line="240" w:lineRule="auto"/>
-              <w:rPr>
-                <w:rFonts w:ascii="Arial Narrow" w:hAnsi="Arial Narrow" w:cs="Arial"/>
-                <w:lang w:val="en-US"/>
-              </w:rPr>
-            </w:pPr>
-            <w:r>
-              <w:rPr>
-                <w:rFonts w:ascii="Arial Narrow" w:hAnsi="Arial Narrow" w:cs="Arial"/>
-                <w:lang w:val="en-US"/>
-              </w:rPr>
-              <w:t xml:space="preserve">uint16_t </w:t>
-            </w:r>
-            <w:proofErr w:type="spellStart"/>
-            <w:proofErr w:type="gramStart"/>
-            <w:r>
-              <w:rPr>
-                <w:rFonts w:ascii="Arial Narrow" w:hAnsi="Arial Narrow" w:cs="Arial"/>
-                <w:lang w:val="en-US"/>
-              </w:rPr>
-              <w:t>ADCRead</w:t>
-            </w:r>
-            <w:proofErr w:type="spellEnd"/>
-            <w:r>
-              <w:rPr>
-                <w:rFonts w:ascii="Arial Narrow" w:hAnsi="Arial Narrow" w:cs="Arial"/>
-                <w:lang w:val="en-US"/>
-              </w:rPr>
               <w:t>( void</w:t>
             </w:r>
             <w:proofErr w:type="gramEnd"/>
@@ -4014,16 +3876,6 @@
               </w:rPr>
               <w:t>}</w:t>
             </w:r>
-          </w:p>
-          <w:p>
-            <w:pPr>
-              <w:spacing w:after="0" w:line="240" w:lineRule="auto"/>
-              <w:jc w:val="center"/>
-              <w:rPr>
-                <w:rFonts w:ascii="Arial Narrow" w:hAnsi="Arial Narrow" w:cs="Arial"/>
-                <w:lang w:val="en-US"/>
-              </w:rPr>
-            </w:pPr>
           </w:p>
           <w:p>
             <w:pPr>
@@ -4465,7 +4317,7 @@
         <w:pStyle w:val="ListParagraph"/>
         <w:numPr>
           <w:ilvl w:val="0"/>
-          <w:numId w:val="46"/>
+          <w:numId w:val="47"/>
         </w:numPr>
         <w:spacing w:after="0" w:line="240" w:lineRule="auto"/>
         <w:jc w:val="both"/>
@@ -4479,7 +4331,6 @@
           <w:rFonts w:ascii="Arial Narrow" w:hAnsi="Arial Narrow" w:cs="Arial"/>
           <w:lang w:val="en-US"/>
         </w:rPr>
-        <w:lastRenderedPageBreak/>
         <w:t xml:space="preserve">Include the computed coefficients into the STM32CubeIDE project. Adapt the </w:t>
       </w:r>
       <w:r>
@@ -4824,7 +4675,7 @@
         <w:pStyle w:val="ListParagraph"/>
         <w:numPr>
           <w:ilvl w:val="0"/>
-          <w:numId w:val="46"/>
+          <w:numId w:val="47"/>
         </w:numPr>
         <w:rPr>
           <w:rFonts w:ascii="Arial Narrow" w:hAnsi="Arial Narrow"/>
@@ -6151,7 +6002,7 @@
   <w:abstractNum w:abstractNumId="6" w15:restartNumberingAfterBreak="0">
     <w:nsid w:val="0C682DAB"/>
     <w:multiLevelType w:val="hybridMultilevel"/>
-    <w:tmpl w:val="36E8C16A"/>
+    <w:tmpl w:val="42C623DC"/>
     <w:lvl w:ilvl="0" w:tplc="0409000F">
       <w:start w:val="1"/>
       <w:numFmt w:val="decimal"/>

</xml_diff>